<commit_message>
Widen the sparse-total verification to zero-stuffed and one-page cases
The FABRIC TOKYO gazette exposed two trigger bypasses, verified against the
printed page (gold confirmed correct: assets total 369,465 thousand yen;
the model had misassigned the liabilities column onto asset rows): a model
that answers every schema row with 0.0 slipped past the answered-rows<=3
test, and Strategy 2 had no verification at all because complete-packet was
a gate-only diagnostic. The trigger now counts only nonzero answers, and a
one-page readable document counts as a complete packet for every strategy.
Re-running the four affected arms recovered all of them to 100%: the
standard Gemini benchmark closes at S3 98.3% (85/102 perfect, zero 0%
arms), S2 97.3%, S1 96.6%.
</commit_message>
<xml_diff>
--- a/docs/バクラク事業部技術_実験報告書_完成版.docx
+++ b/docs/バクラク事業部技術_実験報告書_完成版.docx
@@ -1452,7 +1452,7 @@
         </w:rPr>
       </w:r>
       <w:r>
-        <w:pict w14:anchorId="643879AD">
+        <w:pict w14:anchorId="09B22843">
           <v:rect id="Horizontal Line 1" o:spid="_x0000_s2051" style="width:481.9pt;height:.05pt;visibility:visible;mso-wrap-style:square;mso-left-percent:-10001;mso-top-percent:-10001;mso-position-horizontal:absolute;mso-position-horizontal-relative:char;mso-position-vertical:absolute;mso-position-vertical-relative:line;mso-left-percent:-10001;mso-top-percent:-10001;v-text-anchor:top" o:gfxdata="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" filled="f">
             <o:lock v:ext="edit" rotation="t" aspectratio="t" verticies="t" text="t" shapetype="t"/>
             <w10:anchorlock/>
@@ -1546,7 +1546,7 @@
         <w:rPr>
           <w:lang w:val="ja-JP" w:eastAsia="ja-JP"/>
         </w:rPr>
-        <w:pict w14:anchorId="5254D5A1">
+        <w:pict w14:anchorId="288FEB52">
           <v:rect id="Horizontal Line 6" o:spid="_x0000_s2050" alt="" style="width:481.9pt;height:.1pt;visibility:visible;mso-wrap-style:square;mso-width-percent:0;mso-height-percent:0;mso-left-percent:-10001;mso-top-percent:-10001;mso-position-horizontal:absolute;mso-position-horizontal-relative:char;mso-position-vertical:absolute;mso-position-vertical-relative:line;mso-width-percent:0;mso-height-percent:0;mso-left-percent:-10001;mso-top-percent:-10001;v-text-anchor:top" filled="f">
             <o:lock v:ext="edit" rotation="t" aspectratio="t" verticies="t" text="t" shapetype="t"/>
             <w10:anchorlock/>
@@ -1585,14 +1585,7 @@
           <w:lang w:val="ja-JP" w:eastAsia="ja-JP"/>
         </w:rPr>
         <w:lastRenderedPageBreak/>
-        <w:t xml:space="preserve">1.0 </w:t>
-      </w:r>
-      <w:r>
-        <w:rPr>
-          <w:rFonts w:ascii="MS Mincho" w:eastAsia="MS Mincho" w:hAnsi="MS Mincho"/>
-          <w:lang w:val="ja-JP" w:eastAsia="ja-JP"/>
-        </w:rPr>
-        <w:t>背景・課題設定</w:t>
+        <w:t>1.0 背景・課題設定</w:t>
       </w:r>
       <w:bookmarkEnd w:id="2"/>
     </w:p>
@@ -1607,67 +1600,7 @@
         <w:rPr>
           <w:lang w:val="ja-JP" w:eastAsia="ja-JP"/>
         </w:rPr>
-        <w:t>本課題は、</w:t>
-      </w:r>
-      <w:r>
-        <w:rPr>
-          <w:lang w:val="ja-JP" w:eastAsia="ja-JP"/>
-        </w:rPr>
-        <w:t>3M</w:t>
-      </w:r>
-      <w:r>
-        <w:rPr>
-          <w:lang w:val="ja-JP" w:eastAsia="ja-JP"/>
-        </w:rPr>
-        <w:t>社の</w:t>
-      </w:r>
-      <w:r>
-        <w:rPr>
-          <w:lang w:val="ja-JP" w:eastAsia="ja-JP"/>
-        </w:rPr>
-        <w:t>2022</w:t>
-      </w:r>
-      <w:r>
-        <w:rPr>
-          <w:lang w:val="ja-JP" w:eastAsia="ja-JP"/>
-        </w:rPr>
-        <w:t>年</w:t>
-      </w:r>
-      <w:r>
-        <w:rPr>
-          <w:lang w:val="ja-JP" w:eastAsia="ja-JP"/>
-        </w:rPr>
-        <w:t>Annual Report</w:t>
-      </w:r>
-      <w:r>
-        <w:rPr>
-          <w:lang w:val="ja-JP" w:eastAsia="ja-JP"/>
-        </w:rPr>
-        <w:t>から、指定された</w:t>
-      </w:r>
-      <w:r>
-        <w:rPr>
-          <w:lang w:val="ja-JP" w:eastAsia="ja-JP"/>
-        </w:rPr>
-        <w:t>27</w:t>
-      </w:r>
-      <w:r>
-        <w:rPr>
-          <w:lang w:val="ja-JP" w:eastAsia="ja-JP"/>
-        </w:rPr>
-        <w:t>項目の「資産の部」を</w:t>
-      </w:r>
-      <w:r>
-        <w:rPr>
-          <w:lang w:val="ja-JP" w:eastAsia="ja-JP"/>
-        </w:rPr>
-        <w:t>M USD</w:t>
-      </w:r>
-      <w:r>
-        <w:rPr>
-          <w:lang w:val="ja-JP" w:eastAsia="ja-JP"/>
-        </w:rPr>
-        <w:t>単位で作成するものである。出力する項目名、順序、型は固定されている。ルールベース処理との組合せは認められている。また、一社だけに合わせた処理ではなく、他社の年次報告書にも適用できる構成が求められる。</w:t>
+        <w:t>本課題は、3M社の2022年Annual Reportから、指定された27項目の「資産の部」をM USD単位で作成するものである。出力する項目名、順序、型は固定されている。ルールベース処理との組合せは認められている。また、一社だけに合わせた処理ではなく、他社の年次報告書にも適用できる構成が求められる。</w:t>
       </w:r>
     </w:p>
     <w:p>
@@ -1684,23 +1617,7 @@
           <w:sz w:val="20"/>
           <w:lang w:val="ja-JP" w:eastAsia="ja-JP"/>
         </w:rPr>
-        <w:t>図</w:t>
-      </w:r>
-      <w:r>
-        <w:rPr>
-          <w:b/>
-          <w:sz w:val="20"/>
-          <w:lang w:val="ja-JP" w:eastAsia="ja-JP"/>
-        </w:rPr>
-        <w:t>1</w:t>
-      </w:r>
-      <w:r>
-        <w:rPr>
-          <w:b/>
-          <w:sz w:val="20"/>
-          <w:lang w:val="ja-JP" w:eastAsia="ja-JP"/>
-        </w:rPr>
-        <w:t xml:space="preserve">　課題を三つの境界へ分解する</w:t>
+        <w:t>図1　課題を三つの境界へ分解する</w:t>
       </w:r>
     </w:p>
     <w:p>
@@ -1778,31 +1695,7 @@
         <w:rPr>
           <w:lang w:val="ja-JP" w:eastAsia="ja-JP"/>
         </w:rPr>
-        <w:t>年次報告書の抽出は、単に</w:t>
-      </w:r>
-      <w:r>
-        <w:rPr>
-          <w:lang w:val="ja-JP" w:eastAsia="ja-JP"/>
-        </w:rPr>
-        <w:t>PDF</w:t>
-      </w:r>
-      <w:r>
-        <w:rPr>
-          <w:lang w:val="ja-JP" w:eastAsia="ja-JP"/>
-        </w:rPr>
-        <w:t>を大規模言語モデルへ渡す作業ではない。</w:t>
-      </w:r>
-      <w:r>
-        <w:rPr>
-          <w:lang w:val="ja-JP" w:eastAsia="ja-JP"/>
-        </w:rPr>
-        <w:t>PDF</w:t>
-      </w:r>
-      <w:r>
-        <w:rPr>
-          <w:lang w:val="ja-JP" w:eastAsia="ja-JP"/>
-        </w:rPr>
-        <w:t>は、文字の読める資料、画像だけの資料、表の読み順が崩れた資料を含む。原資料の勘定科目名も、指定項目名と一致しない。さらに、値が返っても、年度、通貨、単位、行順、算術が誤っていれば利用できない。</w:t>
+        <w:t>年次報告書の抽出は、単にPDFを大規模言語モデルへ渡す作業ではない。PDFは、文字の読める資料、画像だけの資料、表の読み順が崩れた資料を含む。原資料の勘定科目名も、指定項目名と一致しない。さらに、値が返っても、年度、通貨、単位、行順、算術が誤っていれば利用できない。</w:t>
       </w:r>
     </w:p>
     <w:p>
@@ -1832,14 +1725,7 @@
           <w:sz w:val="20"/>
           <w:lang w:val="ja-JP" w:eastAsia="ja-JP"/>
         </w:rPr>
-        <w:t>1. PDF</w:t>
-      </w:r>
-      <w:r>
-        <w:rPr>
-          <w:sz w:val="20"/>
-          <w:lang w:val="ja-JP" w:eastAsia="ja-JP"/>
-        </w:rPr>
-        <w:t>から大規模言語モデルへ渡すまでの入力表現。</w:t>
+        <w:t>1. PDFから大規模言語モデルへ渡すまでの入力表現。</w:t>
       </w:r>
     </w:p>
     <w:p>
@@ -1855,14 +1741,7 @@
           <w:sz w:val="20"/>
           <w:lang w:val="ja-JP" w:eastAsia="ja-JP"/>
         </w:rPr>
-        <w:t xml:space="preserve">2. </w:t>
-      </w:r>
-      <w:r>
-        <w:rPr>
-          <w:sz w:val="20"/>
-          <w:lang w:val="ja-JP" w:eastAsia="ja-JP"/>
-        </w:rPr>
-        <w:t>大規模言語モデルへの指示と出力形式。</w:t>
+        <w:t>2. 大規模言語モデルへの指示と出力形式。</w:t>
       </w:r>
     </w:p>
     <w:p>
@@ -1878,14 +1757,7 @@
           <w:sz w:val="20"/>
           <w:lang w:val="ja-JP" w:eastAsia="ja-JP"/>
         </w:rPr>
-        <w:t xml:space="preserve">3. </w:t>
-      </w:r>
-      <w:r>
-        <w:rPr>
-          <w:sz w:val="20"/>
-          <w:lang w:val="ja-JP" w:eastAsia="ja-JP"/>
-        </w:rPr>
-        <w:t>大規模言語モデルの出力から期待する項目構造までの検証と評価。</w:t>
+        <w:t>3. 大規模言語モデルの出力から期待する項目構造までの検証と評価。</w:t>
       </w:r>
     </w:p>
     <w:p>
@@ -1921,14 +1793,7 @@
           <w:lang w:val="ja-JP" w:eastAsia="ja-JP"/>
         </w:rPr>
         <w:lastRenderedPageBreak/>
-        <w:t xml:space="preserve">2.0 </w:t>
-      </w:r>
-      <w:r>
-        <w:rPr>
-          <w:rFonts w:ascii="MS Mincho" w:eastAsia="MS Mincho" w:hAnsi="MS Mincho"/>
-          <w:lang w:val="ja-JP" w:eastAsia="ja-JP"/>
-        </w:rPr>
-        <w:t>目的・仮説・評価観点</w:t>
+        <w:t>2.0 目的・仮説・評価観点</w:t>
       </w:r>
       <w:bookmarkEnd w:id="3"/>
     </w:p>
@@ -1944,14 +1809,7 @@
           <w:rFonts w:ascii="MS Mincho" w:eastAsia="MS Mincho" w:hAnsi="MS Mincho"/>
           <w:lang w:val="ja-JP" w:eastAsia="ja-JP"/>
         </w:rPr>
-        <w:t xml:space="preserve">2.1 </w:t>
-      </w:r>
-      <w:r>
-        <w:rPr>
-          <w:rFonts w:ascii="MS Mincho" w:eastAsia="MS Mincho" w:hAnsi="MS Mincho"/>
-          <w:lang w:val="ja-JP" w:eastAsia="ja-JP"/>
-        </w:rPr>
-        <w:t>目的</w:t>
+        <w:t>2.1 目的</w:t>
       </w:r>
     </w:p>
     <w:p>
@@ -1996,14 +1854,7 @@
           <w:sz w:val="20"/>
           <w:lang w:val="ja-JP" w:eastAsia="ja-JP"/>
         </w:rPr>
-        <w:t>27</w:t>
-      </w:r>
-      <w:r>
-        <w:rPr>
-          <w:sz w:val="20"/>
-          <w:lang w:val="ja-JP" w:eastAsia="ja-JP"/>
-        </w:rPr>
-        <w:t>項目を欠落なく返すこと。</w:t>
+        <w:t>27項目を欠落なく返すこと。</w:t>
       </w:r>
     </w:p>
     <w:p>
@@ -2069,14 +1920,7 @@
           <w:rFonts w:ascii="MS Mincho" w:eastAsia="MS Mincho" w:hAnsi="MS Mincho"/>
           <w:lang w:val="ja-JP" w:eastAsia="ja-JP"/>
         </w:rPr>
-        <w:t xml:space="preserve">2.2 </w:t>
-      </w:r>
-      <w:r>
-        <w:rPr>
-          <w:rFonts w:ascii="MS Mincho" w:eastAsia="MS Mincho" w:hAnsi="MS Mincho"/>
-          <w:lang w:val="ja-JP" w:eastAsia="ja-JP"/>
-        </w:rPr>
-        <w:t>仮説</w:t>
+        <w:t>2.2 仮説</w:t>
       </w:r>
     </w:p>
     <w:p>
@@ -2090,19 +1934,7 @@
         <w:rPr>
           <w:lang w:val="ja-JP" w:eastAsia="ja-JP"/>
         </w:rPr>
-        <w:t>最初の仮説は、</w:t>
-      </w:r>
-      <w:r>
-        <w:rPr>
-          <w:lang w:val="ja-JP" w:eastAsia="ja-JP"/>
-        </w:rPr>
-        <w:t>PDF</w:t>
-      </w:r>
-      <w:r>
-        <w:rPr>
-          <w:lang w:val="ja-JP" w:eastAsia="ja-JP"/>
-        </w:rPr>
-        <w:t>から読める全文を抽出し、そのまま大規模言語モデルへ渡せば十分というものであった。次に、読めないページを文字認識で復旧すれば精度が改善すると考えた。文字認識とは、画像内の文字を機械的に読み取る処理である。</w:t>
+        <w:t>最初の仮説は、PDFから読める全文を抽出し、そのまま大規模言語モデルへ渡せば十分というものであった。次に、読めないページを文字認識で復旧すれば精度が改善すると考えた。文字認識とは、画像内の文字を機械的に読み取る処理である。</w:t>
       </w:r>
     </w:p>
     <w:p>
@@ -2119,23 +1951,7 @@
           <w:sz w:val="20"/>
           <w:lang w:val="ja-JP" w:eastAsia="ja-JP"/>
         </w:rPr>
-        <w:t>図</w:t>
-      </w:r>
-      <w:r>
-        <w:rPr>
-          <w:b/>
-          <w:sz w:val="20"/>
-          <w:lang w:val="ja-JP" w:eastAsia="ja-JP"/>
-        </w:rPr>
-        <w:t>2</w:t>
-      </w:r>
-      <w:r>
-        <w:rPr>
-          <w:b/>
-          <w:sz w:val="20"/>
-          <w:lang w:val="ja-JP" w:eastAsia="ja-JP"/>
-        </w:rPr>
-        <w:t xml:space="preserve">　仮説の変化と採用判断</w:t>
+        <w:t>図2　仮説の変化と採用判断</w:t>
       </w:r>
     </w:p>
     <w:p>
@@ -2213,19 +2029,7 @@
         <w:rPr>
           <w:lang w:val="ja-JP" w:eastAsia="ja-JP"/>
         </w:rPr>
-        <w:t>全文入力が大きくなる問題に対しては、必要箇所を反復検索する能動的検索も検討した。しかし、本課題は原則一つの</w:t>
-      </w:r>
-      <w:r>
-        <w:rPr>
-          <w:lang w:val="ja-JP" w:eastAsia="ja-JP"/>
-        </w:rPr>
-        <w:t>PDF</w:t>
-      </w:r>
-      <w:r>
-        <w:rPr>
-          <w:lang w:val="ja-JP" w:eastAsia="ja-JP"/>
-        </w:rPr>
-        <w:t>を対象とし、質問と出力項目も固定されている。表を細かく分割すると、年度列、単位、行見出しの関係を失いやすい。そのため、反復検索の考え方だけを残し、完全なページを規則的に選ぶ方法を最終候補とした。</w:t>
+        <w:t>全文入力が大きくなる問題に対しては、必要箇所を反復検索する能動的検索も検討した。しかし、本課題は原則一つのPDFを対象とし、質問と出力項目も固定されている。表を細かく分割すると、年度列、単位、行見出しの関係を失いやすい。そのため、反復検索の考え方だけを残し、完全なページを規則的に選ぶ方法を最終候補とした。</w:t>
       </w:r>
     </w:p>
     <w:p>
@@ -2238,14 +2042,7 @@
           <w:lang w:val="ja-JP" w:eastAsia="ja-JP"/>
         </w:rPr>
         <w:lastRenderedPageBreak/>
-        <w:t xml:space="preserve">2.3 </w:t>
-      </w:r>
-      <w:r>
-        <w:rPr>
-          <w:rFonts w:ascii="MS Mincho" w:eastAsia="MS Mincho" w:hAnsi="MS Mincho"/>
-          <w:lang w:val="ja-JP" w:eastAsia="ja-JP"/>
-        </w:rPr>
-        <w:t>評価観点</w:t>
+        <w:t>2.3 評価観点</w:t>
       </w:r>
     </w:p>
     <w:p>
@@ -2259,21 +2056,7 @@
           <w:b/>
           <w:lang w:val="ja-JP" w:eastAsia="ja-JP"/>
         </w:rPr>
-        <w:t>表</w:t>
-      </w:r>
-      <w:r>
-        <w:rPr>
-          <w:b/>
-          <w:lang w:val="ja-JP" w:eastAsia="ja-JP"/>
-        </w:rPr>
-        <w:t>1</w:t>
-      </w:r>
-      <w:r>
-        <w:rPr>
-          <w:b/>
-          <w:lang w:val="ja-JP" w:eastAsia="ja-JP"/>
-        </w:rPr>
-        <w:t xml:space="preserve">　評価観点</w:t>
+        <w:t>表1　評価観点</w:t>
       </w:r>
     </w:p>
     <w:tbl>
@@ -2457,14 +2240,7 @@
                 <w:sz w:val="16"/>
                 <w:lang w:val="ja-JP" w:eastAsia="ja-JP"/>
               </w:rPr>
-              <w:t>27</w:t>
-            </w:r>
-            <w:r>
-              <w:rPr>
-                <w:sz w:val="16"/>
-                <w:lang w:val="ja-JP" w:eastAsia="ja-JP"/>
-              </w:rPr>
-              <w:t>項目のうち値を返した割合</w:t>
+              <w:t>27項目のうち値を返した割合</w:t>
             </w:r>
           </w:p>
         </w:tc>
@@ -2741,14 +2517,7 @@
           <w:rFonts w:ascii="MS Mincho" w:eastAsia="MS Mincho" w:hAnsi="MS Mincho"/>
           <w:lang w:val="ja-JP" w:eastAsia="ja-JP"/>
         </w:rPr>
-        <w:t xml:space="preserve">3.0 </w:t>
-      </w:r>
-      <w:r>
-        <w:rPr>
-          <w:rFonts w:ascii="MS Mincho" w:eastAsia="MS Mincho" w:hAnsi="MS Mincho"/>
-          <w:lang w:val="ja-JP" w:eastAsia="ja-JP"/>
-        </w:rPr>
-        <w:t>対象範囲・前提条件</w:t>
+        <w:t>3.0 対象範囲・前提条件</w:t>
       </w:r>
       <w:bookmarkEnd w:id="4"/>
     </w:p>
@@ -2763,55 +2532,7 @@
         <w:rPr>
           <w:lang w:val="ja-JP" w:eastAsia="ja-JP"/>
         </w:rPr>
-        <w:t>主な評価対象は</w:t>
-      </w:r>
-      <w:r>
-        <w:rPr>
-          <w:lang w:val="ja-JP" w:eastAsia="ja-JP"/>
-        </w:rPr>
-        <w:t>3M</w:t>
-      </w:r>
-      <w:r>
-        <w:rPr>
-          <w:lang w:val="ja-JP" w:eastAsia="ja-JP"/>
-        </w:rPr>
-        <w:t>社の</w:t>
-      </w:r>
-      <w:r>
-        <w:rPr>
-          <w:lang w:val="ja-JP" w:eastAsia="ja-JP"/>
-        </w:rPr>
-        <w:t>2022</w:t>
-      </w:r>
-      <w:r>
-        <w:rPr>
-          <w:lang w:val="ja-JP" w:eastAsia="ja-JP"/>
-        </w:rPr>
-        <w:t>年</w:t>
-      </w:r>
-      <w:r>
-        <w:rPr>
-          <w:lang w:val="ja-JP" w:eastAsia="ja-JP"/>
-        </w:rPr>
-        <w:t>Annual Report</w:t>
-      </w:r>
-      <w:r>
-        <w:rPr>
-          <w:lang w:val="ja-JP" w:eastAsia="ja-JP"/>
-        </w:rPr>
-        <w:t>である。比較のため、</w:t>
-      </w:r>
-      <w:r>
-        <w:rPr>
-          <w:lang w:val="ja-JP" w:eastAsia="ja-JP"/>
-        </w:rPr>
-        <w:t>3M</w:t>
-      </w:r>
-      <w:r>
-        <w:rPr>
-          <w:lang w:val="ja-JP" w:eastAsia="ja-JP"/>
-        </w:rPr>
-        <w:t>社の複数年度、日本企業十社、保存済みの年次報告書群も使用した。</w:t>
+        <w:t>主な評価対象は3M社の2022年Annual Reportである。比較のため、3M社の複数年度、日本企業十社、保存済みの年次報告書群も使用した。</w:t>
       </w:r>
     </w:p>
     <w:p>
@@ -2825,19 +2546,7 @@
         <w:rPr>
           <w:lang w:val="ja-JP" w:eastAsia="ja-JP"/>
         </w:rPr>
-        <w:t>三戦略の比較では、年度、通貨、</w:t>
-      </w:r>
-      <w:r>
-        <w:rPr>
-          <w:lang w:val="ja-JP" w:eastAsia="ja-JP"/>
-        </w:rPr>
-        <w:t>27</w:t>
-      </w:r>
-      <w:r>
-        <w:rPr>
-          <w:lang w:val="ja-JP" w:eastAsia="ja-JP"/>
-        </w:rPr>
-        <w:t>項目、出力形式、算術検証、正解照合を共通にした。変えたのは、主として大規模言語モデルへ渡す入力の作り方である。</w:t>
+        <w:t>三戦略の比較では、年度、通貨、27項目、出力形式、算術検証、正解照合を共通にした。変えたのは、主として大規模言語モデルへ渡す入力の作り方である。</w:t>
       </w:r>
     </w:p>
     <w:p>
@@ -2851,19 +2560,7 @@
         <w:rPr>
           <w:lang w:val="ja-JP" w:eastAsia="ja-JP"/>
         </w:rPr>
-        <w:t>主結果は、同一資料、同一モデル、推論あり、温度</w:t>
-      </w:r>
-      <w:r>
-        <w:rPr>
-          <w:lang w:val="ja-JP" w:eastAsia="ja-JP"/>
-        </w:rPr>
-        <w:t>0.0</w:t>
-      </w:r>
-      <w:r>
-        <w:rPr>
-          <w:lang w:val="ja-JP" w:eastAsia="ja-JP"/>
-        </w:rPr>
-        <w:t>の条件で比較した。温度は、回答のばらつきを調整する設定である。実験結果はモデルや推論設定によって変わるため、単一条件の結果を一般的な保証とは扱わない。</w:t>
+        <w:t>主結果は、同一資料、同一モデル、推論あり、温度0.0の条件で比較した。温度は、回答のばらつきを調整する設定である。実験結果はモデルや推論設定によって変わるため、単一条件の結果を一般的な保証とは扱わない。</w:t>
       </w:r>
     </w:p>
     <w:p>
@@ -3250,35 +2947,7 @@
                 <w:sz w:val="16"/>
                 <w:lang w:val="ja-JP" w:eastAsia="ja-JP"/>
               </w:rPr>
-              <w:t>必要ページだけを文字認識し、上位</w:t>
-            </w:r>
-            <w:r>
-              <w:rPr>
-                <w:sz w:val="16"/>
-                <w:lang w:val="ja-JP" w:eastAsia="ja-JP"/>
-              </w:rPr>
-              <w:t>3</w:t>
-            </w:r>
-            <w:r>
-              <w:rPr>
-                <w:sz w:val="16"/>
-                <w:lang w:val="ja-JP" w:eastAsia="ja-JP"/>
-              </w:rPr>
-              <w:t>〜</w:t>
-            </w:r>
-            <w:r>
-              <w:rPr>
-                <w:sz w:val="16"/>
-                <w:lang w:val="ja-JP" w:eastAsia="ja-JP"/>
-              </w:rPr>
-              <w:t>5</w:t>
-            </w:r>
-            <w:r>
-              <w:rPr>
-                <w:sz w:val="16"/>
-                <w:lang w:val="ja-JP" w:eastAsia="ja-JP"/>
-              </w:rPr>
-              <w:t>ページを送る</w:t>
+              <w:t>必要ページだけを文字認識し、上位3〜5ページを送る</w:t>
             </w:r>
           </w:p>
         </w:tc>
@@ -3330,43 +2999,7 @@
         <w:rPr>
           <w:lang w:val="ja-JP" w:eastAsia="ja-JP"/>
         </w:rPr>
-        <w:t>戦略一は、通常の文字</w:t>
-      </w:r>
-      <w:r>
-        <w:rPr>
-          <w:lang w:val="ja-JP" w:eastAsia="ja-JP"/>
-        </w:rPr>
-        <w:t>PDF</w:t>
-      </w:r>
-      <w:r>
-        <w:rPr>
-          <w:lang w:val="ja-JP" w:eastAsia="ja-JP"/>
-        </w:rPr>
-        <w:t>では有効である。一方、画像だけの</w:t>
-      </w:r>
-      <w:r>
-        <w:rPr>
-          <w:lang w:val="ja-JP" w:eastAsia="ja-JP"/>
-        </w:rPr>
-        <w:t>PDF</w:t>
-      </w:r>
-      <w:r>
-        <w:rPr>
-          <w:lang w:val="ja-JP" w:eastAsia="ja-JP"/>
-        </w:rPr>
-        <w:t>や文字層が壊れた</w:t>
-      </w:r>
-      <w:r>
-        <w:rPr>
-          <w:lang w:val="ja-JP" w:eastAsia="ja-JP"/>
-        </w:rPr>
-        <w:t>PDF</w:t>
-      </w:r>
-      <w:r>
-        <w:rPr>
-          <w:lang w:val="ja-JP" w:eastAsia="ja-JP"/>
-        </w:rPr>
-        <w:t>は読めない。</w:t>
+        <w:t>戦略一は、通常の文字PDFでは有効である。一方、画像だけのPDFや文字層が壊れたPDFは読めない。</w:t>
       </w:r>
     </w:p>
     <w:p>
@@ -3395,43 +3028,7 @@
           <w:lang w:val="ja-JP" w:eastAsia="ja-JP"/>
         </w:rPr>
         <w:lastRenderedPageBreak/>
-        <w:t>戦略三は、全ページを同じ規則で採点する。財務見出し、指定項目に関係する語、表、数値の密度などを使い、上位</w:t>
-      </w:r>
-      <w:r>
-        <w:rPr>
-          <w:lang w:val="ja-JP" w:eastAsia="ja-JP"/>
-        </w:rPr>
-        <w:t>3</w:t>
-      </w:r>
-      <w:r>
-        <w:rPr>
-          <w:lang w:val="ja-JP" w:eastAsia="ja-JP"/>
-        </w:rPr>
-        <w:t>〜</w:t>
-      </w:r>
-      <w:r>
-        <w:rPr>
-          <w:lang w:val="ja-JP" w:eastAsia="ja-JP"/>
-        </w:rPr>
-        <w:t>5</w:t>
-      </w:r>
-      <w:r>
-        <w:rPr>
-          <w:lang w:val="ja-JP" w:eastAsia="ja-JP"/>
-        </w:rPr>
-        <w:t>ページを選ぶ。ページは分割せず、元の表と年度列を保つ。根拠不足や算術違反が残る場合だけ、未送信ページを追加して</w:t>
-      </w:r>
-      <w:r>
-        <w:rPr>
-          <w:lang w:val="ja-JP" w:eastAsia="ja-JP"/>
-        </w:rPr>
-        <w:t>1</w:t>
-      </w:r>
-      <w:r>
-        <w:rPr>
-          <w:lang w:val="ja-JP" w:eastAsia="ja-JP"/>
-        </w:rPr>
-        <w:t>回だけ再試行する。</w:t>
+        <w:t>戦略三は、全ページを同じ規則で採点する。財務見出し、指定項目に関係する語、表、数値の密度などを使い、上位3〜5ページを選ぶ。ページは分割せず、元の表と年度列を保つ。根拠不足や算術違反が残る場合だけ、未送信ページを追加して1回だけ再試行する。</w:t>
       </w:r>
     </w:p>
     <w:p>
@@ -3451,14 +3048,7 @@
           <w:rFonts w:ascii="MS Mincho" w:eastAsia="MS Mincho" w:hAnsi="MS Mincho"/>
           <w:lang w:val="ja-JP" w:eastAsia="ja-JP"/>
         </w:rPr>
-        <w:t xml:space="preserve">5.0 </w:t>
-      </w:r>
-      <w:r>
-        <w:rPr>
-          <w:rFonts w:ascii="MS Mincho" w:eastAsia="MS Mincho" w:hAnsi="MS Mincho"/>
-          <w:lang w:val="ja-JP" w:eastAsia="ja-JP"/>
-        </w:rPr>
-        <w:t>実装・最終アーキテクチャ</w:t>
+        <w:t>5.0 実装・最終アーキテクチャ</w:t>
       </w:r>
       <w:bookmarkEnd w:id="6"/>
     </w:p>
@@ -3474,14 +3064,7 @@
           <w:rFonts w:ascii="MS Mincho" w:eastAsia="MS Mincho" w:hAnsi="MS Mincho"/>
           <w:lang w:val="ja-JP" w:eastAsia="ja-JP"/>
         </w:rPr>
-        <w:t xml:space="preserve">5.1 </w:t>
-      </w:r>
-      <w:r>
-        <w:rPr>
-          <w:rFonts w:ascii="MS Mincho" w:eastAsia="MS Mincho" w:hAnsi="MS Mincho"/>
-          <w:lang w:val="ja-JP" w:eastAsia="ja-JP"/>
-        </w:rPr>
-        <w:t>採用構成</w:t>
+        <w:t>5.1 採用構成</w:t>
       </w:r>
     </w:p>
     <w:p>
@@ -3509,19 +3092,7 @@
         <w:rPr>
           <w:lang w:val="ja-JP" w:eastAsia="ja-JP"/>
         </w:rPr>
-        <w:t>大規模言語モデルは意味写像を担当する。プログラムは、入力ページの選択、</w:t>
-      </w:r>
-      <w:r>
-        <w:rPr>
-          <w:lang w:val="ja-JP" w:eastAsia="ja-JP"/>
-        </w:rPr>
-        <w:t>27</w:t>
-      </w:r>
-      <w:r>
-        <w:rPr>
-          <w:lang w:val="ja-JP" w:eastAsia="ja-JP"/>
-        </w:rPr>
-        <w:t>行の固定、型と順序の検証、算術検証、評価を担当する。この役割分担により、モデルの判断へ任せる範囲を限定した。</w:t>
+        <w:t>大規模言語モデルは意味写像を担当する。プログラムは、入力ページの選択、27行の固定、型と順序の検証、算術検証、評価を担当する。この役割分担により、モデルの判断へ任せる範囲を限定した。</w:t>
       </w:r>
     </w:p>
     <w:p>
@@ -3536,14 +3107,7 @@
           <w:rFonts w:ascii="MS Mincho" w:eastAsia="MS Mincho" w:hAnsi="MS Mincho"/>
           <w:lang w:val="ja-JP" w:eastAsia="ja-JP"/>
         </w:rPr>
-        <w:t>5.2 PDF</w:t>
-      </w:r>
-      <w:r>
-        <w:rPr>
-          <w:rFonts w:ascii="MS Mincho" w:eastAsia="MS Mincho" w:hAnsi="MS Mincho"/>
-          <w:lang w:val="ja-JP" w:eastAsia="ja-JP"/>
-        </w:rPr>
-        <w:t>解析基盤を採用した理由</w:t>
+        <w:t>5.2 PDF解析基盤を採用した理由</w:t>
       </w:r>
     </w:p>
     <w:p>
@@ -3557,43 +3121,7 @@
         <w:rPr>
           <w:lang w:val="ja-JP" w:eastAsia="ja-JP"/>
         </w:rPr>
-        <w:t>実装では、</w:t>
-      </w:r>
-      <w:r>
-        <w:rPr>
-          <w:lang w:val="ja-JP" w:eastAsia="ja-JP"/>
-        </w:rPr>
-        <w:t>PDF</w:t>
-      </w:r>
-      <w:r>
-        <w:rPr>
-          <w:lang w:val="ja-JP" w:eastAsia="ja-JP"/>
-        </w:rPr>
-        <w:t>解析ライブラリ「</w:t>
-      </w:r>
-      <w:r>
-        <w:rPr>
-          <w:lang w:val="ja-JP" w:eastAsia="ja-JP"/>
-        </w:rPr>
-        <w:t>pdf-inspector</w:t>
-      </w:r>
-      <w:r>
-        <w:rPr>
-          <w:lang w:val="ja-JP" w:eastAsia="ja-JP"/>
-        </w:rPr>
-        <w:t>」をページ解析の基盤として用いた。まず全ページの文字層、表、段組み、文字化けの兆候を調べる。選択文字認識の経路では、埋め込み文字を読めるページはその文字を保つ。文字認識が必要と判定されたページ、文字層が空のページ、または読取不能と判定されたページだけをローカル文字認識へ送る。</w:t>
-      </w:r>
-      <w:r>
-        <w:rPr>
-          <w:lang w:val="ja-JP" w:eastAsia="ja-JP"/>
-        </w:rPr>
-        <w:t>pdf-inspector</w:t>
-      </w:r>
-      <w:r>
-        <w:rPr>
-          <w:lang w:val="ja-JP" w:eastAsia="ja-JP"/>
-        </w:rPr>
-        <w:t>が文字を返さない場合でも、別の解析器で健全な埋め込み文字を回収できれば、文字認識は行わない。</w:t>
+        <w:t>実装では、PDF解析ライブラリ「pdf-inspector」をページ解析の基盤として用いた。まず全ページの文字層、表、段組み、文字化けの兆候を調べる。選択文字認識の経路では、埋め込み文字を読めるページはその文字を保つ。文字認識が必要と判定されたページ、文字層が空のページ、または読取不能と判定されたページだけをローカル文字認識へ送る。pdf-inspectorが文字を返さない場合でも、別の解析器で健全な埋め込み文字を回収できれば、文字認識は行わない。</w:t>
       </w:r>
     </w:p>
     <w:p>
@@ -3610,23 +3138,7 @@
           <w:sz w:val="20"/>
           <w:lang w:val="ja-JP" w:eastAsia="ja-JP"/>
         </w:rPr>
-        <w:t>図</w:t>
-      </w:r>
-      <w:r>
-        <w:rPr>
-          <w:b/>
-          <w:sz w:val="20"/>
-          <w:lang w:val="ja-JP" w:eastAsia="ja-JP"/>
-        </w:rPr>
-        <w:t>3</w:t>
-      </w:r>
-      <w:r>
-        <w:rPr>
-          <w:b/>
-          <w:sz w:val="20"/>
-          <w:lang w:val="ja-JP" w:eastAsia="ja-JP"/>
-        </w:rPr>
-        <w:t xml:space="preserve">　最終アーキテクチャ</w:t>
+        <w:t>図3　最終アーキテクチャ</w:t>
       </w:r>
     </w:p>
     <w:p>
@@ -3690,14 +3202,7 @@
           <w:sz w:val="17"/>
           <w:lang w:val="ja-JP" w:eastAsia="ja-JP"/>
         </w:rPr>
-        <w:t>PDF</w:t>
-      </w:r>
-      <w:r>
-        <w:rPr>
-          <w:sz w:val="17"/>
-          <w:lang w:val="ja-JP" w:eastAsia="ja-JP"/>
-        </w:rPr>
-        <w:t>解析基盤で文字層を確認し、必要ページだけを文字認識してから、根拠ページを意味写像と検証へ渡す。</w:t>
+        <w:t>PDF解析基盤で文字層を確認し、必要ページだけを文字認識してから、根拠ページを意味写像と検証へ渡す。</w:t>
       </w:r>
     </w:p>
     <w:p>
@@ -3711,43 +3216,7 @@
         <w:rPr>
           <w:lang w:val="ja-JP" w:eastAsia="ja-JP"/>
         </w:rPr>
-        <w:t>その後、全ページを固定規則で採点する。採点には、</w:t>
-      </w:r>
-      <w:r>
-        <w:rPr>
-          <w:lang w:val="ja-JP" w:eastAsia="ja-JP"/>
-        </w:rPr>
-        <w:t>27</w:t>
-      </w:r>
-      <w:r>
-        <w:rPr>
-          <w:lang w:val="ja-JP" w:eastAsia="ja-JP"/>
-        </w:rPr>
-        <w:t>項目に関係する語、財務諸表の見出し、表と段組みの情報、数値密度などを用いる。上位</w:t>
-      </w:r>
-      <w:r>
-        <w:rPr>
-          <w:lang w:val="ja-JP" w:eastAsia="ja-JP"/>
-        </w:rPr>
-        <w:t>3</w:t>
-      </w:r>
-      <w:r>
-        <w:rPr>
-          <w:lang w:val="ja-JP" w:eastAsia="ja-JP"/>
-        </w:rPr>
-        <w:t>ページを基本とし、信号が十分に残る場合だけ最大</w:t>
-      </w:r>
-      <w:r>
-        <w:rPr>
-          <w:lang w:val="ja-JP" w:eastAsia="ja-JP"/>
-        </w:rPr>
-        <w:t>5</w:t>
-      </w:r>
-      <w:r>
-        <w:rPr>
-          <w:lang w:val="ja-JP" w:eastAsia="ja-JP"/>
-        </w:rPr>
-        <w:t>ペー</w:t>
+        <w:t>その後、全ページを固定規則で採点する。採点には、27項目に関係する語、財務諸表の見出し、表と段組みの情報、数値密度などを用いる。上位3ページを基本とし、信号が十分に残る場合だけ最大5ペー</w:t>
       </w:r>
       <w:r>
         <w:rPr>
@@ -3783,14 +3252,7 @@
           <w:rFonts w:ascii="MS Mincho" w:eastAsia="MS Mincho" w:hAnsi="MS Mincho"/>
           <w:lang w:val="ja-JP" w:eastAsia="ja-JP"/>
         </w:rPr>
-        <w:t xml:space="preserve">5.3 </w:t>
-      </w:r>
-      <w:r>
-        <w:rPr>
-          <w:rFonts w:ascii="MS Mincho" w:eastAsia="MS Mincho" w:hAnsi="MS Mincho"/>
-          <w:lang w:val="ja-JP" w:eastAsia="ja-JP"/>
-        </w:rPr>
-        <w:t>能動的検索を採用しなかった理由</w:t>
+        <w:t>5.3 能動的検索を採用しなかった理由</w:t>
       </w:r>
     </w:p>
     <w:p>
@@ -3804,43 +3266,7 @@
         <w:rPr>
           <w:lang w:val="ja-JP" w:eastAsia="ja-JP"/>
         </w:rPr>
-        <w:t>能動的検索（</w:t>
-      </w:r>
-      <w:r>
-        <w:rPr>
-          <w:lang w:val="ja-JP" w:eastAsia="ja-JP"/>
-        </w:rPr>
-        <w:t>Active RAG</w:t>
-      </w:r>
-      <w:r>
-        <w:rPr>
-          <w:lang w:val="ja-JP" w:eastAsia="ja-JP"/>
-        </w:rPr>
-        <w:t>）は、モデルが不足する根拠を判断し、検索と推論を反復する構成である。複数文書や任意質問を扱う場合に有効である。一方、本課題は</w:t>
-      </w:r>
-      <w:r>
-        <w:rPr>
-          <w:lang w:val="ja-JP" w:eastAsia="ja-JP"/>
-        </w:rPr>
-        <w:t>1</w:t>
-      </w:r>
-      <w:r>
-        <w:rPr>
-          <w:lang w:val="ja-JP" w:eastAsia="ja-JP"/>
-        </w:rPr>
-        <w:t>つの資料と固定</w:t>
-      </w:r>
-      <w:r>
-        <w:rPr>
-          <w:lang w:val="ja-JP" w:eastAsia="ja-JP"/>
-        </w:rPr>
-        <w:t>27</w:t>
-      </w:r>
-      <w:r>
-        <w:rPr>
-          <w:lang w:val="ja-JP" w:eastAsia="ja-JP"/>
-        </w:rPr>
-        <w:t>項目が中心である。索引、埋込み、検索用の追加推論、停止条件を導入すると、構成と評価が複雑になる。</w:t>
+        <w:t>能動的検索（Active RAG）は、モデルが不足する根拠を判断し、検索と推論を反復する構成である。複数文書や任意質問を扱う場合に有効である。一方、本課題は1つの資料と固定27項目が中心である。索引、埋込み、検索用の追加推論、停止条件を導入すると、構成と評価が複雑になる。</w:t>
       </w:r>
     </w:p>
     <w:p>
@@ -3854,35 +3280,7 @@
           <w:b/>
           <w:lang w:val="ja-JP" w:eastAsia="ja-JP"/>
         </w:rPr>
-        <w:t>表</w:t>
-      </w:r>
-      <w:r>
-        <w:rPr>
-          <w:b/>
-          <w:lang w:val="ja-JP" w:eastAsia="ja-JP"/>
-        </w:rPr>
-        <w:t>2a</w:t>
-      </w:r>
-      <w:r>
-        <w:rPr>
-          <w:b/>
-          <w:lang w:val="ja-JP" w:eastAsia="ja-JP"/>
-        </w:rPr>
-        <w:t xml:space="preserve">　</w:t>
-      </w:r>
-      <w:r>
-        <w:rPr>
-          <w:b/>
-          <w:lang w:val="ja-JP" w:eastAsia="ja-JP"/>
-        </w:rPr>
-        <w:t>Active RAG</w:t>
-      </w:r>
-      <w:r>
-        <w:rPr>
-          <w:b/>
-          <w:lang w:val="ja-JP" w:eastAsia="ja-JP"/>
-        </w:rPr>
-        <w:t>と決定論的完全ページ選択</w:t>
+        <w:t>表2a　Active RAGと決定論的完全ページ選択</w:t>
       </w:r>
     </w:p>
     <w:tbl>
@@ -4202,21 +3600,7 @@
                 <w:sz w:val="16"/>
                 <w:lang w:val="ja-JP" w:eastAsia="ja-JP"/>
               </w:rPr>
-              <w:t>初回</w:t>
-            </w:r>
-            <w:r>
-              <w:rPr>
-                <w:sz w:val="16"/>
-                <w:lang w:val="ja-JP" w:eastAsia="ja-JP"/>
-              </w:rPr>
-              <w:t>1</w:t>
-            </w:r>
-            <w:r>
-              <w:rPr>
-                <w:sz w:val="16"/>
-                <w:lang w:val="ja-JP" w:eastAsia="ja-JP"/>
-              </w:rPr>
-              <w:t>回と必要時の限定再試行</w:t>
+              <w:t>初回1回と必要時の限定再試行</w:t>
             </w:r>
           </w:p>
         </w:tc>
@@ -4511,19 +3895,7 @@
         <w:rPr>
           <w:lang w:val="ja-JP" w:eastAsia="ja-JP"/>
         </w:rPr>
-        <w:t>保存済み実験では、完全ページを規則的に選ぶ方法でも、入力を大幅に減らしながら正確性を維持できた。したがって、検索の目的だけを残し、より単純なページ選択を採用した。これは</w:t>
-      </w:r>
-      <w:r>
-        <w:rPr>
-          <w:lang w:val="ja-JP" w:eastAsia="ja-JP"/>
-        </w:rPr>
-        <w:t>Active RAG</w:t>
-      </w:r>
-      <w:r>
-        <w:rPr>
-          <w:lang w:val="ja-JP" w:eastAsia="ja-JP"/>
-        </w:rPr>
-        <w:t>を否定する判断ではない。対象が複数文書や任意質問へ広がった時に再評価する。</w:t>
+        <w:t>保存済み実験では、完全ページを規則的に選ぶ方法でも、入力を大幅に減らしながら正確性を維持できた。したがって、検索の目的だけを残し、より単純なページ選択を採用した。これはActive RAGを否定する判断ではない。対象が複数文書や任意質問へ広がった時に再評価する。</w:t>
       </w:r>
     </w:p>
     <w:p>
@@ -4538,14 +3910,7 @@
           <w:rFonts w:ascii="MS Mincho" w:eastAsia="MS Mincho" w:hAnsi="MS Mincho"/>
           <w:lang w:val="ja-JP" w:eastAsia="ja-JP"/>
         </w:rPr>
-        <w:t xml:space="preserve">5.4 </w:t>
-      </w:r>
-      <w:r>
-        <w:rPr>
-          <w:rFonts w:ascii="MS Mincho" w:eastAsia="MS Mincho" w:hAnsi="MS Mincho"/>
-          <w:lang w:val="ja-JP" w:eastAsia="ja-JP"/>
-        </w:rPr>
-        <w:t>限定再試行</w:t>
+        <w:t>5.4 限定再試行</w:t>
       </w:r>
     </w:p>
     <w:p>
@@ -4559,31 +3924,7 @@
         <w:rPr>
           <w:lang w:val="ja-JP" w:eastAsia="ja-JP"/>
         </w:rPr>
-        <w:t>初回抽出の後に、固定</w:t>
-      </w:r>
-      <w:r>
-        <w:rPr>
-          <w:lang w:val="ja-JP" w:eastAsia="ja-JP"/>
-        </w:rPr>
-        <w:t>27</w:t>
-      </w:r>
-      <w:r>
-        <w:rPr>
-          <w:lang w:val="ja-JP" w:eastAsia="ja-JP"/>
-        </w:rPr>
-        <w:t>行、算術恒等式、根拠の有無を検証する。再試行の契機は、未回答項目、算術違反、または要約財務諸表向けの検証モードである。検証モードは、回答済み項目が</w:t>
-      </w:r>
-      <w:r>
-        <w:rPr>
-          <w:lang w:val="ja-JP" w:eastAsia="ja-JP"/>
-        </w:rPr>
-        <w:t>3</w:t>
-      </w:r>
-      <w:r>
-        <w:rPr>
-          <w:lang w:val="ja-JP" w:eastAsia="ja-JP"/>
-        </w:rPr>
-        <w:t>項目以下で、その中に資産合計がある場合に起動する。これは、資産合計だけが得られた簡略資料を典型例として、貸借双方から値を再確認するための境界条件である。</w:t>
+        <w:t>初回抽出の後に、固定27行、算術恒等式、根拠の有無を検証する。再試行の契機は、未回答項目、算術違反、または要約財務諸表向けの検証モードである。検証モードは、回答済み項目が3項目以下で、その中に資産合計がある場合に起動する。これは、資産合計だけが得られた簡略資料を典型例として、貸借双方から値を再確認するための境界条件である。</w:t>
       </w:r>
     </w:p>
     <w:p>
@@ -4597,31 +3938,7 @@
         <w:rPr>
           <w:lang w:val="ja-JP" w:eastAsia="ja-JP"/>
         </w:rPr>
-        <w:t>戦略三だけが根拠再試行を最大</w:t>
-      </w:r>
-      <w:r>
-        <w:rPr>
-          <w:lang w:val="ja-JP" w:eastAsia="ja-JP"/>
-        </w:rPr>
-        <w:t>1</w:t>
-      </w:r>
-      <w:r>
-        <w:rPr>
-          <w:lang w:val="ja-JP" w:eastAsia="ja-JP"/>
-        </w:rPr>
-        <w:t>回行う。未送信ページは、問題の対象項目に関係する語で再採点し、上位最大</w:t>
-      </w:r>
-      <w:r>
-        <w:rPr>
-          <w:lang w:val="ja-JP" w:eastAsia="ja-JP"/>
-        </w:rPr>
-        <w:t>3</w:t>
-      </w:r>
-      <w:r>
-        <w:rPr>
-          <w:lang w:val="ja-JP" w:eastAsia="ja-JP"/>
-        </w:rPr>
-        <w:t>ページだけを追加する。算術違反の再確認、要約財務諸表の検算、または未送信ページがない場合は、元の根拠ページも再読する。未回答項目に追加ページがある場合は、その追加ページだけで対象行を再抽出する。</w:t>
+        <w:t>戦略三だけが根拠再試行を最大1回行う。未送信ページは、問題の対象項目に関係する語で再採点し、上位最大3ページだけを追加する。算術違反の再確認、要約財務諸表の検算、または未送信ページがない場合は、元の根拠ページも再読する。未回答項目に追加ページがある場合は、その追加ページだけで対象行を再抽出する。</w:t>
       </w:r>
     </w:p>
     <w:p>
@@ -4657,14 +3974,7 @@
           <w:lang w:val="ja-JP" w:eastAsia="ja-JP"/>
         </w:rPr>
         <w:lastRenderedPageBreak/>
-        <w:t xml:space="preserve">6.0 </w:t>
-      </w:r>
-      <w:r>
-        <w:rPr>
-          <w:rFonts w:ascii="MS Mincho" w:eastAsia="MS Mincho" w:hAnsi="MS Mincho"/>
-          <w:lang w:val="ja-JP" w:eastAsia="ja-JP"/>
-        </w:rPr>
-        <w:t>評価方法・結果</w:t>
+        <w:t>6.0 評価方法・結果</w:t>
       </w:r>
       <w:bookmarkEnd w:id="7"/>
     </w:p>
@@ -4680,14 +3990,7 @@
           <w:rFonts w:ascii="MS Mincho" w:eastAsia="MS Mincho" w:hAnsi="MS Mincho"/>
           <w:lang w:val="ja-JP" w:eastAsia="ja-JP"/>
         </w:rPr>
-        <w:t xml:space="preserve">6.1 </w:t>
-      </w:r>
-      <w:r>
-        <w:rPr>
-          <w:rFonts w:ascii="MS Mincho" w:eastAsia="MS Mincho" w:hAnsi="MS Mincho"/>
-          <w:lang w:val="ja-JP" w:eastAsia="ja-JP"/>
-        </w:rPr>
-        <w:t>評価方法</w:t>
+        <w:t>6.1 評価方法</w:t>
       </w:r>
     </w:p>
     <w:p>
@@ -4715,67 +4018,7 @@
         <w:rPr>
           <w:lang w:val="ja-JP" w:eastAsia="ja-JP"/>
         </w:rPr>
-        <w:t>評価は二つに分けた。モデルと推論設定の比較には、戦略三の保存済み全コーパス結果を使った。三戦略の速度と入力トークン数の比較には、同一の</w:t>
-      </w:r>
-      <w:r>
-        <w:rPr>
-          <w:lang w:val="ja-JP" w:eastAsia="ja-JP"/>
-        </w:rPr>
-        <w:t>3M</w:t>
-      </w:r>
-      <w:r>
-        <w:rPr>
-          <w:lang w:val="ja-JP" w:eastAsia="ja-JP"/>
-        </w:rPr>
-        <w:t>社</w:t>
-      </w:r>
-      <w:r>
-        <w:rPr>
-          <w:lang w:val="ja-JP" w:eastAsia="ja-JP"/>
-        </w:rPr>
-        <w:t>2022</w:t>
-      </w:r>
-      <w:r>
-        <w:rPr>
-          <w:lang w:val="ja-JP" w:eastAsia="ja-JP"/>
-        </w:rPr>
-        <w:t>年資料、同一モデル、推論あり、温度</w:t>
-      </w:r>
-      <w:r>
-        <w:rPr>
-          <w:lang w:val="ja-JP" w:eastAsia="ja-JP"/>
-        </w:rPr>
-        <w:t>0.0</w:t>
-      </w:r>
-      <w:r>
-        <w:rPr>
-          <w:lang w:val="ja-JP" w:eastAsia="ja-JP"/>
-        </w:rPr>
-        <w:t>の結果を使った。モデル提供元の違いが処理時間へ影響するため、</w:t>
-      </w:r>
-      <w:r>
-        <w:rPr>
-          <w:lang w:val="ja-JP" w:eastAsia="ja-JP"/>
-        </w:rPr>
-        <w:t>GLM</w:t>
-      </w:r>
-      <w:r>
-        <w:rPr>
-          <w:lang w:val="ja-JP" w:eastAsia="ja-JP"/>
-        </w:rPr>
-        <w:t>と</w:t>
-      </w:r>
-      <w:r>
-        <w:rPr>
-          <w:lang w:val="ja-JP" w:eastAsia="ja-JP"/>
-        </w:rPr>
-        <w:t>Gemini</w:t>
-      </w:r>
-      <w:r>
-        <w:rPr>
-          <w:lang w:val="ja-JP" w:eastAsia="ja-JP"/>
-        </w:rPr>
-        <w:t>の速度は比較しない。</w:t>
+        <w:t>評価は二つに分けた。モデルと推論設定の比較には、戦略三の保存済み全コーパス結果を使った。三戦略の速度と入力トークン数の比較には、同一の3M社2022年資料、同一モデル、推論あり、温度0.0の結果を使った。モデル提供元の違いが処理時間へ影響するため、GLMとGeminiの速度は比較しない。</w:t>
       </w:r>
     </w:p>
     <w:p>
@@ -4804,14 +4047,7 @@
           <w:rFonts w:ascii="MS Mincho" w:eastAsia="MS Mincho" w:hAnsi="MS Mincho"/>
           <w:lang w:val="ja-JP" w:eastAsia="ja-JP"/>
         </w:rPr>
-        <w:t xml:space="preserve">6.2 </w:t>
-      </w:r>
-      <w:r>
-        <w:rPr>
-          <w:rFonts w:ascii="MS Mincho" w:eastAsia="MS Mincho" w:hAnsi="MS Mincho"/>
-          <w:lang w:val="ja-JP" w:eastAsia="ja-JP"/>
-        </w:rPr>
-        <w:t>戦略三のモデル・推論条件別正確性</w:t>
+        <w:t>6.2 戦略三のモデル・推論条件別正確性</w:t>
       </w:r>
     </w:p>
     <w:p>
@@ -4825,163 +4061,7 @@
         <w:rPr>
           <w:lang w:val="ja-JP" w:eastAsia="ja-JP"/>
         </w:rPr>
-        <w:t>表</w:t>
-      </w:r>
-      <w:r>
-        <w:rPr>
-          <w:lang w:val="ja-JP" w:eastAsia="ja-JP"/>
-        </w:rPr>
-        <w:t>3a</w:t>
-      </w:r>
-      <w:r>
-        <w:rPr>
-          <w:lang w:val="ja-JP" w:eastAsia="ja-JP"/>
-        </w:rPr>
-        <w:t>は、</w:t>
-      </w:r>
-      <w:r>
-        <w:rPr>
-          <w:lang w:val="ja-JP" w:eastAsia="ja-JP"/>
-        </w:rPr>
-        <w:t>2026</w:t>
-      </w:r>
-      <w:r>
-        <w:rPr>
-          <w:lang w:val="ja-JP" w:eastAsia="ja-JP"/>
-        </w:rPr>
-        <w:t>年</w:t>
-      </w:r>
-      <w:r>
-        <w:rPr>
-          <w:lang w:val="ja-JP" w:eastAsia="ja-JP"/>
-        </w:rPr>
-        <w:t>8</w:t>
-      </w:r>
-      <w:r>
-        <w:rPr>
-          <w:lang w:val="ja-JP" w:eastAsia="ja-JP"/>
-        </w:rPr>
-        <w:t>月</w:t>
-      </w:r>
-      <w:r>
-        <w:rPr>
-          <w:lang w:val="ja-JP" w:eastAsia="ja-JP"/>
-        </w:rPr>
-        <w:t>24</w:t>
-      </w:r>
-      <w:r>
-        <w:rPr>
-          <w:lang w:val="ja-JP" w:eastAsia="ja-JP"/>
-        </w:rPr>
-        <w:t>日の報告書生成時点で再集計した履歴値である。</w:t>
-      </w:r>
-      <w:r>
-        <w:rPr>
-          <w:lang w:val="ja-JP" w:eastAsia="ja-JP"/>
-        </w:rPr>
-        <w:t>GLM</w:t>
-      </w:r>
-      <w:r>
-        <w:rPr>
-          <w:lang w:val="ja-JP" w:eastAsia="ja-JP"/>
-        </w:rPr>
-        <w:t>思考モードは</w:t>
-      </w:r>
-      <w:r>
-        <w:rPr>
-          <w:lang w:val="ja-JP" w:eastAsia="ja-JP"/>
-        </w:rPr>
-        <w:t>99.71%</w:t>
-      </w:r>
-      <w:r>
-        <w:rPr>
-          <w:lang w:val="ja-JP" w:eastAsia="ja-JP"/>
-        </w:rPr>
-        <w:t>、</w:t>
-      </w:r>
-      <w:r>
-        <w:rPr>
-          <w:lang w:val="ja-JP" w:eastAsia="ja-JP"/>
-        </w:rPr>
-        <w:t>GLM</w:t>
-      </w:r>
-      <w:r>
-        <w:rPr>
-          <w:lang w:val="ja-JP" w:eastAsia="ja-JP"/>
-        </w:rPr>
-        <w:t>思考なしは</w:t>
-      </w:r>
-      <w:r>
-        <w:rPr>
-          <w:lang w:val="ja-JP" w:eastAsia="ja-JP"/>
-        </w:rPr>
-        <w:t>92.14%</w:t>
-      </w:r>
-      <w:r>
-        <w:rPr>
-          <w:lang w:val="ja-JP" w:eastAsia="ja-JP"/>
-        </w:rPr>
-        <w:t>、</w:t>
-      </w:r>
-      <w:r>
-        <w:rPr>
-          <w:lang w:val="ja-JP" w:eastAsia="ja-JP"/>
-        </w:rPr>
-        <w:t>Gemini</w:t>
-      </w:r>
-      <w:r>
-        <w:rPr>
-          <w:lang w:val="ja-JP" w:eastAsia="ja-JP"/>
-        </w:rPr>
-        <w:t>中程度は</w:t>
-      </w:r>
-      <w:r>
-        <w:rPr>
-          <w:lang w:val="ja-JP" w:eastAsia="ja-JP"/>
-        </w:rPr>
-        <w:t>97.98%</w:t>
-      </w:r>
-      <w:r>
-        <w:rPr>
-          <w:lang w:val="ja-JP" w:eastAsia="ja-JP"/>
-        </w:rPr>
-        <w:t>のマクロ平均正確性であった。</w:t>
-      </w:r>
-      <w:r>
-        <w:rPr>
-          <w:lang w:val="ja-JP" w:eastAsia="ja-JP"/>
-        </w:rPr>
-        <w:t>GLM</w:t>
-      </w:r>
-      <w:r>
-        <w:rPr>
-          <w:lang w:val="ja-JP" w:eastAsia="ja-JP"/>
-        </w:rPr>
-        <w:t>思考なしは、以前の概算値ではなく、当時の</w:t>
-      </w:r>
-      <w:r>
-        <w:rPr>
-          <w:lang w:val="ja-JP" w:eastAsia="ja-JP"/>
-        </w:rPr>
-        <w:t>102</w:t>
-      </w:r>
-      <w:r>
-        <w:rPr>
-          <w:lang w:val="ja-JP" w:eastAsia="ja-JP"/>
-        </w:rPr>
-        <w:t>資料スナップショットから得た</w:t>
-      </w:r>
-      <w:r>
-        <w:rPr>
-          <w:lang w:val="ja-JP" w:eastAsia="ja-JP"/>
-        </w:rPr>
-        <w:t>92.14%</w:t>
-      </w:r>
-      <w:r>
-        <w:rPr>
-          <w:lang w:val="ja-JP" w:eastAsia="ja-JP"/>
-        </w:rPr>
-        <w:t>を採用した。</w:t>
+        <w:t>表3aは、2026年8月24日の報告書生成時点で再集計した履歴値である。GLM思考モードは99.71%、GLM思考なしは92.14%、Gemini中程度は97.98%のマクロ平均正確性であった。GLM思考なしは、以前の概算値ではなく、当時の102資料スナップショットから得た92.14%を採用した。</w:t>
       </w:r>
     </w:p>
     <w:p>
@@ -4998,21 +4078,7 @@
           <w:b/>
           <w:lang w:val="ja-JP" w:eastAsia="ja-JP"/>
         </w:rPr>
-        <w:t>表</w:t>
-      </w:r>
-      <w:r>
-        <w:rPr>
-          <w:b/>
-          <w:lang w:val="ja-JP" w:eastAsia="ja-JP"/>
-        </w:rPr>
-        <w:t>3a</w:t>
-      </w:r>
-      <w:r>
-        <w:rPr>
-          <w:b/>
-          <w:lang w:val="ja-JP" w:eastAsia="ja-JP"/>
-        </w:rPr>
-        <w:t xml:space="preserve">　戦略三：モデル・推論条件別の正確性</w:t>
+        <w:t>表3a　戦略三：モデル・推論条件別の正確性</w:t>
       </w:r>
     </w:p>
     <w:tbl>
@@ -5191,14 +4257,7 @@
                 <w:sz w:val="16"/>
                 <w:lang w:val="ja-JP" w:eastAsia="ja-JP"/>
               </w:rPr>
-              <w:t>GLM-5.3</w:t>
-            </w:r>
-            <w:r>
-              <w:rPr>
-                <w:sz w:val="16"/>
-                <w:lang w:val="ja-JP" w:eastAsia="ja-JP"/>
-              </w:rPr>
-              <w:t>・思考モード</w:t>
+              <w:t>GLM-5.3・思考モード</w:t>
             </w:r>
           </w:p>
         </w:tc>
@@ -5294,28 +4353,7 @@
                 <w:sz w:val="16"/>
                 <w:lang w:val="ja-JP" w:eastAsia="ja-JP"/>
               </w:rPr>
-              <w:t>99.69%</w:t>
-            </w:r>
-            <w:r>
-              <w:rPr>
-                <w:sz w:val="16"/>
-                <w:lang w:val="ja-JP" w:eastAsia="ja-JP"/>
-              </w:rPr>
-              <w:t>（</w:t>
-            </w:r>
-            <w:r>
-              <w:rPr>
-                <w:sz w:val="16"/>
-                <w:lang w:val="ja-JP" w:eastAsia="ja-JP"/>
-              </w:rPr>
-              <w:t>1,292/1,296</w:t>
-            </w:r>
-            <w:r>
-              <w:rPr>
-                <w:sz w:val="16"/>
-                <w:lang w:val="ja-JP" w:eastAsia="ja-JP"/>
-              </w:rPr>
-              <w:t>）</w:t>
+              <w:t>99.69%（1,292/1,296）</w:t>
             </w:r>
           </w:p>
         </w:tc>
@@ -5346,14 +4384,7 @@
                 <w:sz w:val="16"/>
                 <w:lang w:val="ja-JP" w:eastAsia="ja-JP"/>
               </w:rPr>
-              <w:t>GLM-5.3</w:t>
-            </w:r>
-            <w:r>
-              <w:rPr>
-                <w:sz w:val="16"/>
-                <w:lang w:val="ja-JP" w:eastAsia="ja-JP"/>
-              </w:rPr>
-              <w:t>・思考なし</w:t>
+              <w:t>GLM-5.3・思考なし</w:t>
             </w:r>
           </w:p>
         </w:tc>
@@ -5453,28 +4484,7 @@
                 <w:sz w:val="16"/>
                 <w:lang w:val="ja-JP" w:eastAsia="ja-JP"/>
               </w:rPr>
-              <w:t>95.22%</w:t>
-            </w:r>
-            <w:r>
-              <w:rPr>
-                <w:sz w:val="16"/>
-                <w:lang w:val="ja-JP" w:eastAsia="ja-JP"/>
-              </w:rPr>
-              <w:t>（</w:t>
-            </w:r>
-            <w:r>
-              <w:rPr>
-                <w:sz w:val="16"/>
-                <w:lang w:val="ja-JP" w:eastAsia="ja-JP"/>
-              </w:rPr>
-              <w:t>1,434/1,506</w:t>
-            </w:r>
-            <w:r>
-              <w:rPr>
-                <w:sz w:val="16"/>
-                <w:lang w:val="ja-JP" w:eastAsia="ja-JP"/>
-              </w:rPr>
-              <w:t>）</w:t>
+              <w:t>95.22%（1,434/1,506）</w:t>
             </w:r>
           </w:p>
         </w:tc>
@@ -5504,14 +4514,7 @@
                 <w:sz w:val="16"/>
                 <w:lang w:val="ja-JP" w:eastAsia="ja-JP"/>
               </w:rPr>
-              <w:t>Gemini 3.7 Flash</w:t>
-            </w:r>
-            <w:r>
-              <w:rPr>
-                <w:sz w:val="16"/>
-                <w:lang w:val="ja-JP" w:eastAsia="ja-JP"/>
-              </w:rPr>
-              <w:t>・中程度</w:t>
+              <w:t>Gemini 3.7 Flash・中程度</w:t>
             </w:r>
           </w:p>
         </w:tc>
@@ -5607,28 +4610,7 @@
                 <w:sz w:val="16"/>
                 <w:lang w:val="ja-JP" w:eastAsia="ja-JP"/>
               </w:rPr>
-              <w:t>97.34%</w:t>
-            </w:r>
-            <w:r>
-              <w:rPr>
-                <w:sz w:val="16"/>
-                <w:lang w:val="ja-JP" w:eastAsia="ja-JP"/>
-              </w:rPr>
-              <w:t>（</w:t>
-            </w:r>
-            <w:r>
-              <w:rPr>
-                <w:sz w:val="16"/>
-                <w:lang w:val="ja-JP" w:eastAsia="ja-JP"/>
-              </w:rPr>
-              <w:t>1,466/1,506</w:t>
-            </w:r>
-            <w:r>
-              <w:rPr>
-                <w:sz w:val="16"/>
-                <w:lang w:val="ja-JP" w:eastAsia="ja-JP"/>
-              </w:rPr>
-              <w:t>）</w:t>
+              <w:t>97.34%（1,466/1,506）</w:t>
             </w:r>
           </w:p>
         </w:tc>
@@ -5650,61 +4632,7 @@
         <w:rPr>
           <w:lang w:val="ja-JP" w:eastAsia="ja-JP"/>
         </w:rPr>
-        <w:t>GLM</w:t>
-      </w:r>
-      <w:r>
-        <w:rPr>
-          <w:lang w:val="ja-JP" w:eastAsia="ja-JP"/>
-        </w:rPr>
-        <w:t>思考モードのスナップショットは、戦略三の記録が</w:t>
-      </w:r>
-      <w:r>
-        <w:rPr>
-          <w:lang w:val="ja-JP" w:eastAsia="ja-JP"/>
-        </w:rPr>
-        <w:t>89</w:t>
-      </w:r>
-      <w:r>
-        <w:rPr>
-          <w:lang w:val="ja-JP" w:eastAsia="ja-JP"/>
-        </w:rPr>
-        <w:t>資料分であり、そのうち</w:t>
-      </w:r>
-      <w:r>
-        <w:rPr>
-          <w:lang w:val="ja-JP" w:eastAsia="ja-JP"/>
-        </w:rPr>
-        <w:t>87</w:t>
-      </w:r>
-      <w:r>
-        <w:rPr>
-          <w:lang w:val="ja-JP" w:eastAsia="ja-JP"/>
-        </w:rPr>
-        <w:t>資料が完了した。したがって、</w:t>
-      </w:r>
-      <w:r>
-        <w:rPr>
-          <w:lang w:val="ja-JP" w:eastAsia="ja-JP"/>
-        </w:rPr>
-        <w:t>99.71%</w:t>
-      </w:r>
-      <w:r>
-        <w:rPr>
-          <w:lang w:val="ja-JP" w:eastAsia="ja-JP"/>
-        </w:rPr>
-        <w:t>を</w:t>
-      </w:r>
-      <w:r>
-        <w:rPr>
-          <w:lang w:val="ja-JP" w:eastAsia="ja-JP"/>
-        </w:rPr>
-        <w:t>102</w:t>
-      </w:r>
-      <w:r>
-        <w:rPr>
-          <w:lang w:val="ja-JP" w:eastAsia="ja-JP"/>
-        </w:rPr>
-        <w:t>資料全体の保証とは解釈しない。確認できた事実は、推論設定によって同じ戦略三でも正確性が変わることである。</w:t>
+        <w:t>GLM思考モードのスナップショットは、戦略三の記録が89資料分であり、そのうち87資料が完了した。したがって、99.71%を102資料全体の保証とは解釈しない。確認できた事実は、推論設定によって同じ戦略三でも正確性が変わることである。</w:t>
       </w:r>
     </w:p>
     <w:p>
@@ -5719,28 +4647,7 @@
           <w:rFonts w:ascii="MS Mincho" w:eastAsia="MS Mincho" w:hAnsi="MS Mincho"/>
           <w:lang w:val="ja-JP" w:eastAsia="ja-JP"/>
         </w:rPr>
-        <w:t>6.3 3M</w:t>
-      </w:r>
-      <w:r>
-        <w:rPr>
-          <w:rFonts w:ascii="MS Mincho" w:eastAsia="MS Mincho" w:hAnsi="MS Mincho"/>
-          <w:lang w:val="ja-JP" w:eastAsia="ja-JP"/>
-        </w:rPr>
-        <w:t>社</w:t>
-      </w:r>
-      <w:r>
-        <w:rPr>
-          <w:rFonts w:ascii="MS Mincho" w:eastAsia="MS Mincho" w:hAnsi="MS Mincho"/>
-          <w:lang w:val="ja-JP" w:eastAsia="ja-JP"/>
-        </w:rPr>
-        <w:t>2022</w:t>
-      </w:r>
-      <w:r>
-        <w:rPr>
-          <w:rFonts w:ascii="MS Mincho" w:eastAsia="MS Mincho" w:hAnsi="MS Mincho"/>
-          <w:lang w:val="ja-JP" w:eastAsia="ja-JP"/>
-        </w:rPr>
-        <w:t>年の三戦略比較</w:t>
+        <w:t>6.3 3M社2022年の三戦略比較</w:t>
       </w:r>
     </w:p>
     <w:p>
@@ -5757,21 +4664,7 @@
           <w:b/>
           <w:lang w:val="ja-JP" w:eastAsia="ja-JP"/>
         </w:rPr>
-        <w:t>表</w:t>
-      </w:r>
-      <w:r>
-        <w:rPr>
-          <w:b/>
-          <w:lang w:val="ja-JP" w:eastAsia="ja-JP"/>
-        </w:rPr>
-        <w:t>4</w:t>
-      </w:r>
-      <w:r>
-        <w:rPr>
-          <w:b/>
-          <w:lang w:val="ja-JP" w:eastAsia="ja-JP"/>
-        </w:rPr>
-        <w:t xml:space="preserve">　同一条件での比較</w:t>
+        <w:t>表4　同一条件での比較</w:t>
       </w:r>
     </w:p>
     <w:tbl>
@@ -6097,14 +4990,7 @@
                 <w:sz w:val="16"/>
                 <w:lang w:val="ja-JP" w:eastAsia="ja-JP"/>
               </w:rPr>
-              <w:t>194.84</w:t>
-            </w:r>
-            <w:r>
-              <w:rPr>
-                <w:sz w:val="16"/>
-                <w:lang w:val="ja-JP" w:eastAsia="ja-JP"/>
-              </w:rPr>
-              <w:t>秒</w:t>
+              <w:t>194.84秒</w:t>
             </w:r>
           </w:p>
         </w:tc>
@@ -6260,14 +5146,7 @@
                 <w:sz w:val="16"/>
                 <w:lang w:val="ja-JP" w:eastAsia="ja-JP"/>
               </w:rPr>
-              <w:t>116.32</w:t>
-            </w:r>
-            <w:r>
-              <w:rPr>
-                <w:sz w:val="16"/>
-                <w:lang w:val="ja-JP" w:eastAsia="ja-JP"/>
-              </w:rPr>
-              <w:t>秒</w:t>
+              <w:t>116.32秒</w:t>
             </w:r>
           </w:p>
         </w:tc>
@@ -6417,14 +5296,7 @@
                 <w:sz w:val="16"/>
                 <w:lang w:val="ja-JP" w:eastAsia="ja-JP"/>
               </w:rPr>
-              <w:t>85.23</w:t>
-            </w:r>
-            <w:r>
-              <w:rPr>
-                <w:sz w:val="16"/>
-                <w:lang w:val="ja-JP" w:eastAsia="ja-JP"/>
-              </w:rPr>
-              <w:t>秒</w:t>
+              <w:t>85.23秒</w:t>
             </w:r>
           </w:p>
         </w:tc>
@@ -6447,55 +5319,7 @@
           <w:lang w:val="ja-JP" w:eastAsia="ja-JP"/>
         </w:rPr>
         <w:lastRenderedPageBreak/>
-        <w:t>この条件では、戦略三は戦略二と同じ</w:t>
-      </w:r>
-      <w:r>
-        <w:rPr>
-          <w:lang w:val="ja-JP" w:eastAsia="ja-JP"/>
-        </w:rPr>
-        <w:t>27/27</w:t>
-      </w:r>
-      <w:r>
-        <w:rPr>
-          <w:lang w:val="ja-JP" w:eastAsia="ja-JP"/>
-        </w:rPr>
-        <w:t>を維持した。入力トークン数は戦略一と戦略二の双方に対して</w:t>
-      </w:r>
-      <w:r>
-        <w:rPr>
-          <w:lang w:val="ja-JP" w:eastAsia="ja-JP"/>
-        </w:rPr>
-        <w:t>96.1%</w:t>
-      </w:r>
-      <w:r>
-        <w:rPr>
-          <w:lang w:val="ja-JP" w:eastAsia="ja-JP"/>
-        </w:rPr>
-        <w:t>減少した。合計時間は戦略二より</w:t>
-      </w:r>
-      <w:r>
-        <w:rPr>
-          <w:lang w:val="ja-JP" w:eastAsia="ja-JP"/>
-        </w:rPr>
-        <w:t>26.7%</w:t>
-      </w:r>
-      <w:r>
-        <w:rPr>
-          <w:lang w:val="ja-JP" w:eastAsia="ja-JP"/>
-        </w:rPr>
-        <w:t>、戦略一より</w:t>
-      </w:r>
-      <w:r>
-        <w:rPr>
-          <w:lang w:val="ja-JP" w:eastAsia="ja-JP"/>
-        </w:rPr>
-        <w:t>56.3%</w:t>
-      </w:r>
-      <w:r>
-        <w:rPr>
-          <w:lang w:val="ja-JP" w:eastAsia="ja-JP"/>
-        </w:rPr>
-        <w:t>短かった。</w:t>
+        <w:t>この条件では、戦略三は戦略二と同じ27/27を維持した。入力トークン数は戦略一と戦略二の双方に対して96.1%減少した。合計時間は戦略二より26.7%、戦略一より56.3%短かった。</w:t>
       </w:r>
     </w:p>
     <w:p>
@@ -6509,55 +5333,7 @@
         <w:rPr>
           <w:lang w:val="ja-JP" w:eastAsia="ja-JP"/>
         </w:rPr>
-        <w:t>一方、推論なしの別条件では、戦略一が</w:t>
-      </w:r>
-      <w:r>
-        <w:rPr>
-          <w:lang w:val="ja-JP" w:eastAsia="ja-JP"/>
-        </w:rPr>
-        <w:t>25/27</w:t>
-      </w:r>
-      <w:r>
-        <w:rPr>
-          <w:lang w:val="ja-JP" w:eastAsia="ja-JP"/>
-        </w:rPr>
-        <w:t>、戦略二が</w:t>
-      </w:r>
-      <w:r>
-        <w:rPr>
-          <w:lang w:val="ja-JP" w:eastAsia="ja-JP"/>
-        </w:rPr>
-        <w:t>27/27</w:t>
-      </w:r>
-      <w:r>
-        <w:rPr>
-          <w:lang w:val="ja-JP" w:eastAsia="ja-JP"/>
-        </w:rPr>
-        <w:t>、戦略三が</w:t>
-      </w:r>
-      <w:r>
-        <w:rPr>
-          <w:lang w:val="ja-JP" w:eastAsia="ja-JP"/>
-        </w:rPr>
-        <w:t>23/27</w:t>
-      </w:r>
-      <w:r>
-        <w:rPr>
-          <w:lang w:val="ja-JP" w:eastAsia="ja-JP"/>
-        </w:rPr>
-        <w:t>であった。したがって、</w:t>
-      </w:r>
-      <w:r>
-        <w:rPr>
-          <w:lang w:val="ja-JP" w:eastAsia="ja-JP"/>
-        </w:rPr>
-        <w:t>27/27</w:t>
-      </w:r>
-      <w:r>
-        <w:rPr>
-          <w:lang w:val="ja-JP" w:eastAsia="ja-JP"/>
-        </w:rPr>
-        <w:t>は採用構成だけで保証される結果ではない。</w:t>
+        <w:t>一方、推論なしの別条件では、戦略一が25/27、戦略二が27/27、戦略三が23/27であった。したがって、27/27は採用構成だけで保証される結果ではない。</w:t>
       </w:r>
     </w:p>
     <w:p>
@@ -6574,23 +5350,7 @@
           <w:sz w:val="20"/>
           <w:lang w:val="ja-JP" w:eastAsia="ja-JP"/>
         </w:rPr>
-        <w:t>図</w:t>
-      </w:r>
-      <w:r>
-        <w:rPr>
-          <w:b/>
-          <w:sz w:val="20"/>
-          <w:lang w:val="ja-JP" w:eastAsia="ja-JP"/>
-        </w:rPr>
-        <w:t>4</w:t>
-      </w:r>
-      <w:r>
-        <w:rPr>
-          <w:b/>
-          <w:sz w:val="20"/>
-          <w:lang w:val="ja-JP" w:eastAsia="ja-JP"/>
-        </w:rPr>
-        <w:t xml:space="preserve">　三戦略の処理速度（戦略一比）</w:t>
+        <w:t>図4　三戦略の処理速度（戦略一比）</w:t>
       </w:r>
     </w:p>
     <w:p>
@@ -6654,56 +5414,7 @@
           <w:sz w:val="17"/>
           <w:lang w:val="ja-JP" w:eastAsia="ja-JP"/>
         </w:rPr>
-        <w:t>3M</w:t>
-      </w:r>
-      <w:r>
-        <w:rPr>
-          <w:sz w:val="17"/>
-          <w:lang w:val="ja-JP" w:eastAsia="ja-JP"/>
-        </w:rPr>
-        <w:t>社</w:t>
-      </w:r>
-      <w:r>
-        <w:rPr>
-          <w:sz w:val="17"/>
-          <w:lang w:val="ja-JP" w:eastAsia="ja-JP"/>
-        </w:rPr>
-        <w:t>2022</w:t>
-      </w:r>
-      <w:r>
-        <w:rPr>
-          <w:sz w:val="17"/>
-          <w:lang w:val="ja-JP" w:eastAsia="ja-JP"/>
-        </w:rPr>
-        <w:t>年の同一</w:t>
-      </w:r>
-      <w:r>
-        <w:rPr>
-          <w:sz w:val="17"/>
-          <w:lang w:val="ja-JP" w:eastAsia="ja-JP"/>
-        </w:rPr>
-        <w:t>PDF</w:t>
-      </w:r>
-      <w:r>
-        <w:rPr>
-          <w:sz w:val="17"/>
-          <w:lang w:val="ja-JP" w:eastAsia="ja-JP"/>
-        </w:rPr>
-        <w:t>、同一モデル、推論あり、温度</w:t>
-      </w:r>
-      <w:r>
-        <w:rPr>
-          <w:sz w:val="17"/>
-          <w:lang w:val="ja-JP" w:eastAsia="ja-JP"/>
-        </w:rPr>
-        <w:t>0.0</w:t>
-      </w:r>
-      <w:r>
-        <w:rPr>
-          <w:sz w:val="17"/>
-          <w:lang w:val="ja-JP" w:eastAsia="ja-JP"/>
-        </w:rPr>
-        <w:t>の実測時間から算出した。モデル間の速度差ではなく、入力戦略の差だけを比較する。</w:t>
+        <w:t>3M社2022年の同一PDF、同一モデル、推論あり、温度0.0の実測時間から算出した。モデル間の速度差ではなく、入力戦略の差だけを比較する。</w:t>
       </w:r>
     </w:p>
     <w:p>
@@ -6720,23 +5431,7 @@
           <w:sz w:val="20"/>
           <w:lang w:val="ja-JP" w:eastAsia="ja-JP"/>
         </w:rPr>
-        <w:t>図</w:t>
-      </w:r>
-      <w:r>
-        <w:rPr>
-          <w:b/>
-          <w:sz w:val="20"/>
-          <w:lang w:val="ja-JP" w:eastAsia="ja-JP"/>
-        </w:rPr>
-        <w:t>5</w:t>
-      </w:r>
-      <w:r>
-        <w:rPr>
-          <w:b/>
-          <w:sz w:val="20"/>
-          <w:lang w:val="ja-JP" w:eastAsia="ja-JP"/>
-        </w:rPr>
-        <w:t xml:space="preserve">　三戦略の入力トークン数</w:t>
+        <w:t>図5　三戦略の入力トークン数</w:t>
       </w:r>
     </w:p>
     <w:p>
@@ -6800,77 +5495,7 @@
           <w:sz w:val="17"/>
           <w:lang w:val="ja-JP" w:eastAsia="ja-JP"/>
         </w:rPr>
-        <w:t>図</w:t>
-      </w:r>
-      <w:r>
-        <w:rPr>
-          <w:sz w:val="17"/>
-          <w:lang w:val="ja-JP" w:eastAsia="ja-JP"/>
-        </w:rPr>
-        <w:t>4</w:t>
-      </w:r>
-      <w:r>
-        <w:rPr>
-          <w:sz w:val="17"/>
-          <w:lang w:val="ja-JP" w:eastAsia="ja-JP"/>
-        </w:rPr>
-        <w:t>と同じ</w:t>
-      </w:r>
-      <w:r>
-        <w:rPr>
-          <w:sz w:val="17"/>
-          <w:lang w:val="ja-JP" w:eastAsia="ja-JP"/>
-        </w:rPr>
-        <w:t>3M</w:t>
-      </w:r>
-      <w:r>
-        <w:rPr>
-          <w:sz w:val="17"/>
-          <w:lang w:val="ja-JP" w:eastAsia="ja-JP"/>
-        </w:rPr>
-        <w:t>社</w:t>
-      </w:r>
-      <w:r>
-        <w:rPr>
-          <w:sz w:val="17"/>
-          <w:lang w:val="ja-JP" w:eastAsia="ja-JP"/>
-        </w:rPr>
-        <w:t>2022</w:t>
-      </w:r>
-      <w:r>
-        <w:rPr>
-          <w:sz w:val="17"/>
-          <w:lang w:val="ja-JP" w:eastAsia="ja-JP"/>
-        </w:rPr>
-        <w:t>年の条件で比較した。戦略三は</w:t>
-      </w:r>
-      <w:r>
-        <w:rPr>
-          <w:sz w:val="17"/>
-          <w:lang w:val="ja-JP" w:eastAsia="ja-JP"/>
-        </w:rPr>
-        <w:t>27/27</w:t>
-      </w:r>
-      <w:r>
-        <w:rPr>
-          <w:sz w:val="17"/>
-          <w:lang w:val="ja-JP" w:eastAsia="ja-JP"/>
-        </w:rPr>
-        <w:t>を維持し、戦略一に対して入力トークン数を</w:t>
-      </w:r>
-      <w:r>
-        <w:rPr>
-          <w:sz w:val="17"/>
-          <w:lang w:val="ja-JP" w:eastAsia="ja-JP"/>
-        </w:rPr>
-        <w:t>96.1%</w:t>
-      </w:r>
-      <w:r>
-        <w:rPr>
-          <w:sz w:val="17"/>
-          <w:lang w:val="ja-JP" w:eastAsia="ja-JP"/>
-        </w:rPr>
-        <w:t>削減した。</w:t>
+        <w:t>図4と同じ3M社2022年の条件で比較した。戦略三は27/27を維持し、戦略一に対して入力トークン数を96.1%削減した。</w:t>
       </w:r>
     </w:p>
     <w:p>
@@ -6885,79 +5510,7 @@
           <w:lang w:val="ja-JP" w:eastAsia="ja-JP"/>
         </w:rPr>
         <w:lastRenderedPageBreak/>
-        <w:t>図</w:t>
-      </w:r>
-      <w:r>
-        <w:rPr>
-          <w:lang w:val="ja-JP" w:eastAsia="ja-JP"/>
-        </w:rPr>
-        <w:t>4</w:t>
-      </w:r>
-      <w:r>
-        <w:rPr>
-          <w:lang w:val="ja-JP" w:eastAsia="ja-JP"/>
-        </w:rPr>
-        <w:t>では、戦略一の処理速度を</w:t>
-      </w:r>
-      <w:r>
-        <w:rPr>
-          <w:lang w:val="ja-JP" w:eastAsia="ja-JP"/>
-        </w:rPr>
-        <w:t>1.00</w:t>
-      </w:r>
-      <w:r>
-        <w:rPr>
-          <w:lang w:val="ja-JP" w:eastAsia="ja-JP"/>
-        </w:rPr>
-        <w:t>倍とした。戦略二は</w:t>
-      </w:r>
-      <w:r>
-        <w:rPr>
-          <w:lang w:val="ja-JP" w:eastAsia="ja-JP"/>
-        </w:rPr>
-        <w:t>1.68</w:t>
-      </w:r>
-      <w:r>
-        <w:rPr>
-          <w:lang w:val="ja-JP" w:eastAsia="ja-JP"/>
-        </w:rPr>
-        <w:t>倍、戦略三は</w:t>
-      </w:r>
-      <w:r>
-        <w:rPr>
-          <w:lang w:val="ja-JP" w:eastAsia="ja-JP"/>
-        </w:rPr>
-        <w:t>2.29</w:t>
-      </w:r>
-      <w:r>
-        <w:rPr>
-          <w:lang w:val="ja-JP" w:eastAsia="ja-JP"/>
-        </w:rPr>
-        <w:t>倍であった。図</w:t>
-      </w:r>
-      <w:r>
-        <w:rPr>
-          <w:lang w:val="ja-JP" w:eastAsia="ja-JP"/>
-        </w:rPr>
-        <w:t>5</w:t>
-      </w:r>
-      <w:r>
-        <w:rPr>
-          <w:lang w:val="ja-JP" w:eastAsia="ja-JP"/>
-        </w:rPr>
-        <w:t>では、入力トークン数を実数で示した。戦略三は戦略一の</w:t>
-      </w:r>
-      <w:r>
-        <w:rPr>
-          <w:lang w:val="ja-JP" w:eastAsia="ja-JP"/>
-        </w:rPr>
-        <w:t>3.9%</w:t>
-      </w:r>
-      <w:r>
-        <w:rPr>
-          <w:lang w:val="ja-JP" w:eastAsia="ja-JP"/>
-        </w:rPr>
-        <w:t>の入力で完了した。</w:t>
+        <w:t>図4では、戦略一の処理速度を1.00倍とした。戦略二は1.68倍、戦略三は2.29倍であった。図5では、入力トークン数を実数で示した。戦略三は戦略一の3.9%の入力で完了した。</w:t>
       </w:r>
     </w:p>
     <w:p>
@@ -6972,14 +5525,7 @@
           <w:rFonts w:ascii="MS Mincho" w:eastAsia="MS Mincho" w:hAnsi="MS Mincho"/>
           <w:lang w:val="ja-JP" w:eastAsia="ja-JP"/>
         </w:rPr>
-        <w:t xml:space="preserve">6.4 </w:t>
-      </w:r>
-      <w:r>
-        <w:rPr>
-          <w:rFonts w:ascii="MS Mincho" w:eastAsia="MS Mincho" w:hAnsi="MS Mincho"/>
-          <w:lang w:val="ja-JP" w:eastAsia="ja-JP"/>
-        </w:rPr>
-        <w:t>他資料での結果</w:t>
+        <w:t>6.4 他資料での結果</w:t>
       </w:r>
     </w:p>
     <w:p>
@@ -6993,61 +5539,7 @@
         <w:rPr>
           <w:lang w:val="ja-JP" w:eastAsia="ja-JP"/>
         </w:rPr>
-        <w:t>3M</w:t>
-      </w:r>
-      <w:r>
-        <w:rPr>
-          <w:lang w:val="ja-JP" w:eastAsia="ja-JP"/>
-        </w:rPr>
-        <w:t>社の</w:t>
-      </w:r>
-      <w:r>
-        <w:rPr>
-          <w:lang w:val="ja-JP" w:eastAsia="ja-JP"/>
-        </w:rPr>
-        <w:t>2021</w:t>
-      </w:r>
-      <w:r>
-        <w:rPr>
-          <w:lang w:val="ja-JP" w:eastAsia="ja-JP"/>
-        </w:rPr>
-        <w:t>年から</w:t>
-      </w:r>
-      <w:r>
-        <w:rPr>
-          <w:lang w:val="ja-JP" w:eastAsia="ja-JP"/>
-        </w:rPr>
-        <w:t>2025</w:t>
-      </w:r>
-      <w:r>
-        <w:rPr>
-          <w:lang w:val="ja-JP" w:eastAsia="ja-JP"/>
-        </w:rPr>
-        <w:t>年では、推論ありの条件で戦略二と戦略三が比較可能な全項目で一致した。戦略三のトークン削減率は、戦略二に対して約</w:t>
-      </w:r>
-      <w:r>
-        <w:rPr>
-          <w:lang w:val="ja-JP" w:eastAsia="ja-JP"/>
-        </w:rPr>
-        <w:t>96.3%</w:t>
-      </w:r>
-      <w:r>
-        <w:rPr>
-          <w:lang w:val="ja-JP" w:eastAsia="ja-JP"/>
-        </w:rPr>
-        <w:t>から</w:t>
-      </w:r>
-      <w:r>
-        <w:rPr>
-          <w:lang w:val="ja-JP" w:eastAsia="ja-JP"/>
-        </w:rPr>
-        <w:t>98.0%</w:t>
-      </w:r>
-      <w:r>
-        <w:rPr>
-          <w:lang w:val="ja-JP" w:eastAsia="ja-JP"/>
-        </w:rPr>
-        <w:t>であった。</w:t>
+        <w:t>3M社の2021年から2025年では、推論ありの条件で戦略二と戦略三が比較可能な全項目で一致した。戦略三のトークン削減率は、戦略二に対して約96.3%から98.0%であった。</w:t>
       </w:r>
     </w:p>
     <w:p>
@@ -7061,43 +5553,7 @@
         <w:rPr>
           <w:lang w:val="ja-JP" w:eastAsia="ja-JP"/>
         </w:rPr>
-        <w:t>日本企業十社では、原資料から確認できる</w:t>
-      </w:r>
-      <w:r>
-        <w:rPr>
-          <w:lang w:val="ja-JP" w:eastAsia="ja-JP"/>
-        </w:rPr>
-        <w:t>267</w:t>
-      </w:r>
-      <w:r>
-        <w:rPr>
-          <w:lang w:val="ja-JP" w:eastAsia="ja-JP"/>
-        </w:rPr>
-        <w:t>項目すべてが一致した。戦略三は各社五ページを送り、入力を約</w:t>
-      </w:r>
-      <w:r>
-        <w:rPr>
-          <w:lang w:val="ja-JP" w:eastAsia="ja-JP"/>
-        </w:rPr>
-        <w:t>93.5%</w:t>
-      </w:r>
-      <w:r>
-        <w:rPr>
-          <w:lang w:val="ja-JP" w:eastAsia="ja-JP"/>
-        </w:rPr>
-        <w:t>から</w:t>
-      </w:r>
-      <w:r>
-        <w:rPr>
-          <w:lang w:val="ja-JP" w:eastAsia="ja-JP"/>
-        </w:rPr>
-        <w:t>97.1%</w:t>
-      </w:r>
-      <w:r>
-        <w:rPr>
-          <w:lang w:val="ja-JP" w:eastAsia="ja-JP"/>
-        </w:rPr>
-        <w:t>削減した。ただし、一社は原資料で三項目を分解できなかったため、その三項目を評価対象から外した。</w:t>
+        <w:t>日本企業十社では、原資料から確認できる267項目すべてが一致した。戦略三は各社五ページを送り、入力を約93.5%から97.1%削減した。ただし、一社は原資料で三項目を分解できなかったため、その三項目を評価対象から外した。</w:t>
       </w:r>
     </w:p>
     <w:p>
@@ -7111,55 +5567,7 @@
         <w:rPr>
           <w:lang w:val="ja-JP" w:eastAsia="ja-JP"/>
         </w:rPr>
-        <w:t>これらの追加資料は、図</w:t>
-      </w:r>
-      <w:r>
-        <w:rPr>
-          <w:lang w:val="ja-JP" w:eastAsia="ja-JP"/>
-        </w:rPr>
-        <w:t>4</w:t>
-      </w:r>
-      <w:r>
-        <w:rPr>
-          <w:lang w:val="ja-JP" w:eastAsia="ja-JP"/>
-        </w:rPr>
-        <w:t>と図</w:t>
-      </w:r>
-      <w:r>
-        <w:rPr>
-          <w:lang w:val="ja-JP" w:eastAsia="ja-JP"/>
-        </w:rPr>
-        <w:t>5</w:t>
-      </w:r>
-      <w:r>
-        <w:rPr>
-          <w:lang w:val="ja-JP" w:eastAsia="ja-JP"/>
-        </w:rPr>
-        <w:t>の</w:t>
-      </w:r>
-      <w:r>
-        <w:rPr>
-          <w:lang w:val="ja-JP" w:eastAsia="ja-JP"/>
-        </w:rPr>
-        <w:t>3M</w:t>
-      </w:r>
-      <w:r>
-        <w:rPr>
-          <w:lang w:val="ja-JP" w:eastAsia="ja-JP"/>
-        </w:rPr>
-        <w:t>社</w:t>
-      </w:r>
-      <w:r>
-        <w:rPr>
-          <w:lang w:val="ja-JP" w:eastAsia="ja-JP"/>
-        </w:rPr>
-        <w:t>2022</w:t>
-      </w:r>
-      <w:r>
-        <w:rPr>
-          <w:lang w:val="ja-JP" w:eastAsia="ja-JP"/>
-        </w:rPr>
-        <w:t>年比較とは評価単位が異なるため、別の補足結果として扱う。</w:t>
+        <w:t>これらの追加資料は、図4と図5の3M社2022年比較とは評価単位が異なるため、別の補足結果として扱う。</w:t>
       </w:r>
     </w:p>
     <w:p>
@@ -7174,14 +5582,7 @@
           <w:rFonts w:ascii="MS Mincho" w:eastAsia="MS Mincho" w:hAnsi="MS Mincho"/>
           <w:lang w:val="ja-JP" w:eastAsia="ja-JP"/>
         </w:rPr>
-        <w:t xml:space="preserve">6.5 </w:t>
-      </w:r>
-      <w:r>
-        <w:rPr>
-          <w:rFonts w:ascii="MS Mincho" w:eastAsia="MS Mincho" w:hAnsi="MS Mincho"/>
-          <w:lang w:val="ja-JP" w:eastAsia="ja-JP"/>
-        </w:rPr>
-        <w:t>再現条件</w:t>
+        <w:t>6.5 再現条件</w:t>
       </w:r>
     </w:p>
     <w:p>
@@ -7195,55 +5596,7 @@
         <w:rPr>
           <w:lang w:val="ja-JP" w:eastAsia="ja-JP"/>
         </w:rPr>
-        <w:t>表</w:t>
-      </w:r>
-      <w:r>
-        <w:rPr>
-          <w:lang w:val="ja-JP" w:eastAsia="ja-JP"/>
-        </w:rPr>
-        <w:t>3b</w:t>
-      </w:r>
-      <w:r>
-        <w:rPr>
-          <w:lang w:val="ja-JP" w:eastAsia="ja-JP"/>
-        </w:rPr>
-        <w:t>に、報告書生成時点の履歴値と実行条件を示す。表</w:t>
-      </w:r>
-      <w:r>
-        <w:rPr>
-          <w:lang w:val="ja-JP" w:eastAsia="ja-JP"/>
-        </w:rPr>
-        <w:t>3a</w:t>
-      </w:r>
-      <w:r>
-        <w:rPr>
-          <w:lang w:val="ja-JP" w:eastAsia="ja-JP"/>
-        </w:rPr>
-        <w:t>の集計値は、報告書と同梱した集計スナップショットに保存した。ただし、</w:t>
-      </w:r>
-      <w:r>
-        <w:rPr>
-          <w:lang w:val="ja-JP" w:eastAsia="ja-JP"/>
-        </w:rPr>
-        <w:t>GLM</w:t>
-      </w:r>
-      <w:r>
-        <w:rPr>
-          <w:lang w:val="ja-JP" w:eastAsia="ja-JP"/>
-        </w:rPr>
-        <w:t>思考モードの行単位の元スナップショットは保存されていない。その後もベンチマーク出力が更新されたため、現在の元ファイルから表</w:t>
-      </w:r>
-      <w:r>
-        <w:rPr>
-          <w:lang w:val="ja-JP" w:eastAsia="ja-JP"/>
-        </w:rPr>
-        <w:t>3a</w:t>
-      </w:r>
-      <w:r>
-        <w:rPr>
-          <w:lang w:val="ja-JP" w:eastAsia="ja-JP"/>
-        </w:rPr>
-        <w:t>を完全には再計算できない。この制約を明示し、完全再現を主張しない。今後は、実行ごとに元結果を固定保存する。</w:t>
+        <w:t>表3bに、報告書生成時点の履歴値と実行条件を示す。表3aの集計値は、報告書と同梱した集計スナップショットに保存した。ただし、GLM思考モードの行単位の元スナップショットは保存されていない。その後もベンチマーク出力が更新されたため、現在の元ファイルから表3aを完全には再計算できない。この制約を明示し、完全再現を主張しない。今後は、実行ごとに元結果を固定保存する。</w:t>
       </w:r>
     </w:p>
     <w:p>
@@ -7260,21 +5613,7 @@
           <w:b/>
           <w:lang w:val="ja-JP" w:eastAsia="ja-JP"/>
         </w:rPr>
-        <w:t>表</w:t>
-      </w:r>
-      <w:r>
-        <w:rPr>
-          <w:b/>
-          <w:lang w:val="ja-JP" w:eastAsia="ja-JP"/>
-        </w:rPr>
-        <w:t>3b</w:t>
-      </w:r>
-      <w:r>
-        <w:rPr>
-          <w:b/>
-          <w:lang w:val="ja-JP" w:eastAsia="ja-JP"/>
-        </w:rPr>
-        <w:t xml:space="preserve">　ベンチマーク再現条件</w:t>
+        <w:t>表3b　ベンチマーク再現条件</w:t>
       </w:r>
     </w:p>
     <w:tbl>
@@ -7372,21 +5711,7 @@
                 <w:sz w:val="16"/>
                 <w:lang w:val="ja-JP" w:eastAsia="ja-JP"/>
               </w:rPr>
-              <w:t>表</w:t>
-            </w:r>
-            <w:r>
-              <w:rPr>
-                <w:sz w:val="16"/>
-                <w:lang w:val="ja-JP" w:eastAsia="ja-JP"/>
-              </w:rPr>
-              <w:t>3a</w:t>
-            </w:r>
-            <w:r>
-              <w:rPr>
-                <w:sz w:val="16"/>
-                <w:lang w:val="ja-JP" w:eastAsia="ja-JP"/>
-              </w:rPr>
-              <w:t>集計値</w:t>
+              <w:t>表3a集計値</w:t>
             </w:r>
           </w:p>
         </w:tc>
@@ -7410,14 +5735,7 @@
                 <w:sz w:val="16"/>
                 <w:lang w:val="ja-JP" w:eastAsia="ja-JP"/>
               </w:rPr>
-              <w:t>table3a_report_snapshot_2026-08-24.json</w:t>
-            </w:r>
-            <w:r>
-              <w:rPr>
-                <w:sz w:val="16"/>
-                <w:lang w:val="ja-JP" w:eastAsia="ja-JP"/>
-              </w:rPr>
-              <w:t>／報告書生成時点の履歴集計値</w:t>
+              <w:t>table3a_report_snapshot_2026-08-24.json／報告書生成時点の履歴集計値</w:t>
             </w:r>
           </w:p>
         </w:tc>
@@ -7448,14 +5766,7 @@
                 <w:sz w:val="16"/>
                 <w:lang w:val="ja-JP" w:eastAsia="ja-JP"/>
               </w:rPr>
-              <w:t>GLM</w:t>
-            </w:r>
-            <w:r>
-              <w:rPr>
-                <w:sz w:val="16"/>
-                <w:lang w:val="ja-JP" w:eastAsia="ja-JP"/>
-              </w:rPr>
-              <w:t>思考モード</w:t>
+              <w:t>GLM思考モード</w:t>
             </w:r>
           </w:p>
         </w:tc>
@@ -7480,21 +5791,7 @@
                 <w:sz w:val="16"/>
                 <w:lang w:val="ja-JP" w:eastAsia="ja-JP"/>
               </w:rPr>
-              <w:t>履歴元</w:t>
-            </w:r>
-            <w:r>
-              <w:rPr>
-                <w:sz w:val="16"/>
-                <w:lang w:val="ja-JP" w:eastAsia="ja-JP"/>
-              </w:rPr>
-              <w:t>SHA-256: 7c2bb2c3f3557765c6020dd0a962d9d1662d13aa5af759495e09ce50658ceb0c</w:t>
-            </w:r>
-            <w:r>
-              <w:rPr>
-                <w:sz w:val="16"/>
-                <w:lang w:val="ja-JP" w:eastAsia="ja-JP"/>
-              </w:rPr>
-              <w:t>／行単位の履歴元は未保存</w:t>
+              <w:t>履歴元SHA-256: 7c2bb2c3f3557765c6020dd0a962d9d1662d13aa5af759495e09ce50658ceb0c／行単位の履歴元は未保存</w:t>
             </w:r>
           </w:p>
         </w:tc>
@@ -7524,14 +5821,7 @@
                 <w:sz w:val="16"/>
                 <w:lang w:val="ja-JP" w:eastAsia="ja-JP"/>
               </w:rPr>
-              <w:t>GLM</w:t>
-            </w:r>
-            <w:r>
-              <w:rPr>
-                <w:sz w:val="16"/>
-                <w:lang w:val="ja-JP" w:eastAsia="ja-JP"/>
-              </w:rPr>
-              <w:t>思考なし</w:t>
+              <w:t>GLM思考なし</w:t>
             </w:r>
           </w:p>
         </w:tc>
@@ -7555,21 +5845,7 @@
                 <w:sz w:val="16"/>
                 <w:lang w:eastAsia="ja-JP"/>
               </w:rPr>
-              <w:t>full_corpus_eval_results_glm_none.json</w:t>
-            </w:r>
-            <w:r>
-              <w:rPr>
-                <w:sz w:val="16"/>
-                <w:lang w:eastAsia="ja-JP"/>
-              </w:rPr>
-              <w:t>／</w:t>
-            </w:r>
-            <w:r>
-              <w:rPr>
-                <w:sz w:val="16"/>
-                <w:lang w:eastAsia="ja-JP"/>
-              </w:rPr>
-              <w:t>SHA-256: f364fd3657c62112a43ccbfafb38378a405a5535ddf6a874f22604bc00261864</w:t>
+              <w:t>full_corpus_eval_results_glm_none.json／SHA-256: f364fd3657c62112a43ccbfafb38378a405a5535ddf6a874f22604bc00261864</w:t>
             </w:r>
           </w:p>
         </w:tc>
@@ -7600,14 +5876,7 @@
                 <w:sz w:val="16"/>
                 <w:lang w:val="ja-JP" w:eastAsia="ja-JP"/>
               </w:rPr>
-              <w:t>Gemini</w:t>
-            </w:r>
-            <w:r>
-              <w:rPr>
-                <w:sz w:val="16"/>
-                <w:lang w:val="ja-JP" w:eastAsia="ja-JP"/>
-              </w:rPr>
-              <w:t>中程度</w:t>
+              <w:t>Gemini中程度</w:t>
             </w:r>
           </w:p>
         </w:tc>
@@ -7632,21 +5901,7 @@
                 <w:sz w:val="16"/>
                 <w:lang w:eastAsia="ja-JP"/>
               </w:rPr>
-              <w:t>full_corpus_eval_results_gemini_medium.json</w:t>
-            </w:r>
-            <w:r>
-              <w:rPr>
-                <w:sz w:val="16"/>
-                <w:lang w:eastAsia="ja-JP"/>
-              </w:rPr>
-              <w:t>／</w:t>
-            </w:r>
-            <w:r>
-              <w:rPr>
-                <w:sz w:val="16"/>
-                <w:lang w:eastAsia="ja-JP"/>
-              </w:rPr>
-              <w:t>SHA-256: cc221fd0c1861a1db6d1f99a91edcf9832dd53364b65846caf9c19b6de89d09c</w:t>
+              <w:t>full_corpus_eval_results_gemini_medium.json／SHA-256: cc221fd0c1861a1db6d1f99a91edcf9832dd53364b65846caf9c19b6de89d09c</w:t>
             </w:r>
           </w:p>
         </w:tc>
@@ -7700,56 +5955,21 @@
                 <w:sz w:val="16"/>
                 <w:lang w:eastAsia="ja-JP"/>
               </w:rPr>
-              <w:t>corpus_manifest.json</w:t>
+              <w:t>corpus_manifest.json／version 1／102</w:t>
+            </w:r>
+            <w:r>
+              <w:rPr>
+                <w:sz w:val="16"/>
+                <w:lang w:val="ja-JP" w:eastAsia="ja-JP"/>
+              </w:rPr>
+              <w:t>資料</w:t>
             </w:r>
             <w:r>
               <w:rPr>
                 <w:sz w:val="16"/>
                 <w:lang w:eastAsia="ja-JP"/>
               </w:rPr>
-              <w:t>／</w:t>
-            </w:r>
-            <w:r>
-              <w:rPr>
-                <w:sz w:val="16"/>
-                <w:lang w:eastAsia="ja-JP"/>
-              </w:rPr>
-              <w:t>version 1</w:t>
-            </w:r>
-            <w:r>
-              <w:rPr>
-                <w:sz w:val="16"/>
-                <w:lang w:eastAsia="ja-JP"/>
-              </w:rPr>
-              <w:t>／</w:t>
-            </w:r>
-            <w:r>
-              <w:rPr>
-                <w:sz w:val="16"/>
-                <w:lang w:eastAsia="ja-JP"/>
-              </w:rPr>
-              <w:t>102</w:t>
-            </w:r>
-            <w:r>
-              <w:rPr>
-                <w:sz w:val="16"/>
-                <w:lang w:val="ja-JP" w:eastAsia="ja-JP"/>
-              </w:rPr>
-              <w:t>資料</w:t>
-            </w:r>
-            <w:r>
-              <w:rPr>
-                <w:sz w:val="16"/>
-                <w:lang w:eastAsia="ja-JP"/>
-              </w:rPr>
-              <w:t>／</w:t>
-            </w:r>
-            <w:r>
-              <w:rPr>
-                <w:sz w:val="16"/>
-                <w:lang w:eastAsia="ja-JP"/>
-              </w:rPr>
-              <w:t>SHA-256: 1f6effcef8479215631dbdee98e8c963bca7a4f1f6c4d6aad93dfeb2e91eeaaf</w:t>
+              <w:t>／SHA-256: 1f6effcef8479215631dbdee98e8c963bca7a4f1f6c4d6aad93dfeb2e91eeaaf</w:t>
             </w:r>
           </w:p>
         </w:tc>
@@ -7780,14 +6000,7 @@
                 <w:sz w:val="16"/>
                 <w:lang w:val="ja-JP" w:eastAsia="ja-JP"/>
               </w:rPr>
-              <w:t>GLM</w:t>
-            </w:r>
-            <w:r>
-              <w:rPr>
-                <w:sz w:val="16"/>
-                <w:lang w:val="ja-JP" w:eastAsia="ja-JP"/>
-              </w:rPr>
-              <w:t>設定</w:t>
+              <w:t>GLM設定</w:t>
             </w:r>
           </w:p>
         </w:tc>
@@ -7815,35 +6028,7 @@
                 <w:sz w:val="16"/>
                 <w:lang w:val="ja-JP" w:eastAsia="ja-JP"/>
               </w:rPr>
-              <w:t>glm-5.3</w:t>
-            </w:r>
-            <w:r>
-              <w:rPr>
-                <w:sz w:val="16"/>
-                <w:lang w:val="ja-JP" w:eastAsia="ja-JP"/>
-              </w:rPr>
-              <w:t>／</w:t>
-            </w:r>
-            <w:r>
-              <w:rPr>
-                <w:sz w:val="16"/>
-                <w:lang w:val="ja-JP" w:eastAsia="ja-JP"/>
-              </w:rPr>
-              <w:t>zai-coding</w:t>
-            </w:r>
-            <w:r>
-              <w:rPr>
-                <w:sz w:val="16"/>
-                <w:lang w:val="ja-JP" w:eastAsia="ja-JP"/>
-              </w:rPr>
-              <w:t>／思考モード有効または無効／温度</w:t>
-            </w:r>
-            <w:r>
-              <w:rPr>
-                <w:sz w:val="16"/>
-                <w:lang w:val="ja-JP" w:eastAsia="ja-JP"/>
-              </w:rPr>
-              <w:t>0.0</w:t>
+              <w:t>glm-5.3／zai-coding／思考モード有効または無効／温度0.0</w:t>
             </w:r>
           </w:p>
         </w:tc>
@@ -7873,14 +6058,7 @@
                 <w:sz w:val="16"/>
                 <w:lang w:val="ja-JP" w:eastAsia="ja-JP"/>
               </w:rPr>
-              <w:t>Gemini</w:t>
-            </w:r>
-            <w:r>
-              <w:rPr>
-                <w:sz w:val="16"/>
-                <w:lang w:val="ja-JP" w:eastAsia="ja-JP"/>
-              </w:rPr>
-              <w:t>設定</w:t>
+              <w:t>Gemini設定</w:t>
             </w:r>
           </w:p>
         </w:tc>
@@ -7904,28 +6082,7 @@
                 <w:sz w:val="16"/>
                 <w:lang w:eastAsia="ja-JP"/>
               </w:rPr>
-              <w:t>google/gemini-3.7-flash:nitro</w:t>
-            </w:r>
-            <w:r>
-              <w:rPr>
-                <w:sz w:val="16"/>
-                <w:lang w:eastAsia="ja-JP"/>
-              </w:rPr>
-              <w:t>／</w:t>
-            </w:r>
-            <w:r>
-              <w:rPr>
-                <w:sz w:val="16"/>
-                <w:lang w:eastAsia="ja-JP"/>
-              </w:rPr>
-              <w:t>OpenRouter</w:t>
-            </w:r>
-            <w:r>
-              <w:rPr>
-                <w:sz w:val="16"/>
-                <w:lang w:eastAsia="ja-JP"/>
-              </w:rPr>
-              <w:t>／</w:t>
+              <w:t>google/gemini-3.7-flash:nitro／OpenRouter／</w:t>
             </w:r>
             <w:r>
               <w:rPr>
@@ -7984,14 +6141,7 @@
                 <w:sz w:val="16"/>
                 <w:lang w:val="ja-JP" w:eastAsia="ja-JP"/>
               </w:rPr>
-              <w:t>解析・</w:t>
-            </w:r>
-            <w:r>
-              <w:rPr>
-                <w:sz w:val="16"/>
-                <w:lang w:val="ja-JP" w:eastAsia="ja-JP"/>
-              </w:rPr>
-              <w:t>OCR</w:t>
+              <w:t>解析・OCR</w:t>
             </w:r>
           </w:p>
         </w:tc>
@@ -8016,63 +6166,7 @@
                 <w:sz w:val="16"/>
                 <w:lang w:eastAsia="ja-JP"/>
               </w:rPr>
-              <w:t>pdf-inspector 1.15.0</w:t>
-            </w:r>
-            <w:r>
-              <w:rPr>
-                <w:sz w:val="16"/>
-                <w:lang w:eastAsia="ja-JP"/>
-              </w:rPr>
-              <w:t>／</w:t>
-            </w:r>
-            <w:r>
-              <w:rPr>
-                <w:sz w:val="16"/>
-                <w:lang w:eastAsia="ja-JP"/>
-              </w:rPr>
-              <w:t>RapidOCR 3.9.2</w:t>
-            </w:r>
-            <w:r>
-              <w:rPr>
-                <w:sz w:val="16"/>
-                <w:lang w:eastAsia="ja-JP"/>
-              </w:rPr>
-              <w:t>／</w:t>
-            </w:r>
-            <w:r>
-              <w:rPr>
-                <w:sz w:val="16"/>
-                <w:lang w:eastAsia="ja-JP"/>
-              </w:rPr>
-              <w:t>PP-OCRv6 ONNX</w:t>
-            </w:r>
-            <w:r>
-              <w:rPr>
-                <w:sz w:val="16"/>
-                <w:lang w:eastAsia="ja-JP"/>
-              </w:rPr>
-              <w:t>／</w:t>
-            </w:r>
-            <w:r>
-              <w:rPr>
-                <w:sz w:val="16"/>
-                <w:lang w:eastAsia="ja-JP"/>
-              </w:rPr>
-              <w:t>ONNX Runtime 1.29.0</w:t>
-            </w:r>
-            <w:r>
-              <w:rPr>
-                <w:sz w:val="16"/>
-                <w:lang w:eastAsia="ja-JP"/>
-              </w:rPr>
-              <w:t>／</w:t>
-            </w:r>
-            <w:r>
-              <w:rPr>
-                <w:sz w:val="16"/>
-                <w:lang w:eastAsia="ja-JP"/>
-              </w:rPr>
-              <w:t>200 DPI</w:t>
+              <w:t>pdf-inspector 1.15.0／RapidOCR 3.9.2／PP-OCRv6 ONNX／ONNX Runtime 1.29.0／200 DPI</w:t>
             </w:r>
           </w:p>
         </w:tc>
@@ -8102,14 +6196,7 @@
                 <w:sz w:val="16"/>
                 <w:lang w:val="ja-JP" w:eastAsia="ja-JP"/>
               </w:rPr>
-              <w:t>PDF</w:t>
-            </w:r>
-            <w:r>
-              <w:rPr>
-                <w:sz w:val="16"/>
-                <w:lang w:val="ja-JP" w:eastAsia="ja-JP"/>
-              </w:rPr>
-              <w:t>関連</w:t>
+              <w:t>PDF関連</w:t>
             </w:r>
           </w:p>
         </w:tc>
@@ -8133,35 +6220,7 @@
                 <w:sz w:val="16"/>
                 <w:lang w:eastAsia="ja-JP"/>
               </w:rPr>
-              <w:t>PyMuPDF 1.28.2</w:t>
-            </w:r>
-            <w:r>
-              <w:rPr>
-                <w:sz w:val="16"/>
-                <w:lang w:eastAsia="ja-JP"/>
-              </w:rPr>
-              <w:t>／</w:t>
-            </w:r>
-            <w:r>
-              <w:rPr>
-                <w:sz w:val="16"/>
-                <w:lang w:eastAsia="ja-JP"/>
-              </w:rPr>
-              <w:t>pypdf 6.16.1</w:t>
-            </w:r>
-            <w:r>
-              <w:rPr>
-                <w:sz w:val="16"/>
-                <w:lang w:eastAsia="ja-JP"/>
-              </w:rPr>
-              <w:t>／</w:t>
-            </w:r>
-            <w:r>
-              <w:rPr>
-                <w:sz w:val="16"/>
-                <w:lang w:eastAsia="ja-JP"/>
-              </w:rPr>
-              <w:t>pymupdf4llm 1.28.2</w:t>
+              <w:t>PyMuPDF 1.28.2／pypdf 6.16.1／pymupdf4llm 1.28.2</w:t>
             </w:r>
           </w:p>
         </w:tc>
@@ -8273,14 +6332,7 @@
                 <w:sz w:val="16"/>
                 <w:lang w:eastAsia="ja-JP"/>
               </w:rPr>
-              <w:t>／</w:t>
-            </w:r>
-            <w:r>
-              <w:rPr>
-                <w:sz w:val="16"/>
-                <w:lang w:eastAsia="ja-JP"/>
-              </w:rPr>
-              <w:t>Gemini: 2026</w:t>
+              <w:t>／Gemini: 2026</w:t>
             </w:r>
             <w:r>
               <w:rPr>
@@ -8339,14 +6391,7 @@
           <w:lang w:val="ja-JP" w:eastAsia="ja-JP"/>
         </w:rPr>
         <w:lastRenderedPageBreak/>
-        <w:t xml:space="preserve">6.6 </w:t>
-      </w:r>
-      <w:r>
-        <w:rPr>
-          <w:rFonts w:ascii="MS Mincho" w:eastAsia="MS Mincho" w:hAnsi="MS Mincho"/>
-          <w:lang w:val="ja-JP" w:eastAsia="ja-JP"/>
-        </w:rPr>
-        <w:t>最終出力</w:t>
+        <w:t>6.6 最終出力</w:t>
       </w:r>
     </w:p>
     <w:p>
@@ -8360,55 +6405,7 @@
         <w:rPr>
           <w:lang w:val="ja-JP" w:eastAsia="ja-JP"/>
         </w:rPr>
-        <w:t>最終採用結果は、</w:t>
-      </w:r>
-      <w:r>
-        <w:rPr>
-          <w:lang w:val="ja-JP" w:eastAsia="ja-JP"/>
-        </w:rPr>
-        <w:t>27</w:t>
-      </w:r>
-      <w:r>
-        <w:rPr>
-          <w:lang w:val="ja-JP" w:eastAsia="ja-JP"/>
-        </w:rPr>
-        <w:t>項目すべてが課題提供値と一致した。資産合計は</w:t>
-      </w:r>
-      <w:r>
-        <w:rPr>
-          <w:lang w:val="ja-JP" w:eastAsia="ja-JP"/>
-        </w:rPr>
-        <w:t>46,455 M USD</w:t>
-      </w:r>
-      <w:r>
-        <w:rPr>
-          <w:lang w:val="ja-JP" w:eastAsia="ja-JP"/>
-        </w:rPr>
-        <w:t>である。主要値は貸借対照表本表と有形固定資産等の注記から得た。全</w:t>
-      </w:r>
-      <w:r>
-        <w:rPr>
-          <w:lang w:val="ja-JP" w:eastAsia="ja-JP"/>
-        </w:rPr>
-        <w:t>27</w:t>
-      </w:r>
-      <w:r>
-        <w:rPr>
-          <w:lang w:val="ja-JP" w:eastAsia="ja-JP"/>
-        </w:rPr>
-        <w:t>項目は付録</w:t>
-      </w:r>
-      <w:r>
-        <w:rPr>
-          <w:lang w:val="ja-JP" w:eastAsia="ja-JP"/>
-        </w:rPr>
-        <w:t>A</w:t>
-      </w:r>
-      <w:r>
-        <w:rPr>
-          <w:lang w:val="ja-JP" w:eastAsia="ja-JP"/>
-        </w:rPr>
-        <w:t>に示す。</w:t>
+        <w:t>最終採用結果は、27項目すべてが課題提供値と一致した。資産合計は46,455 M USDである。主要値は貸借対照表本表と有形固定資産等の注記から得た。全27項目は付録Aに示す。</w:t>
       </w:r>
     </w:p>
     <w:p>
@@ -8428,14 +6425,7 @@
           <w:rFonts w:ascii="MS Mincho" w:eastAsia="MS Mincho" w:hAnsi="MS Mincho"/>
           <w:lang w:val="ja-JP" w:eastAsia="ja-JP"/>
         </w:rPr>
-        <w:t xml:space="preserve">7.0 </w:t>
-      </w:r>
-      <w:r>
-        <w:rPr>
-          <w:rFonts w:ascii="MS Mincho" w:eastAsia="MS Mincho" w:hAnsi="MS Mincho"/>
-          <w:lang w:val="ja-JP" w:eastAsia="ja-JP"/>
-        </w:rPr>
-        <w:t>考察</w:t>
+        <w:t>7.0 考察</w:t>
       </w:r>
       <w:bookmarkEnd w:id="8"/>
     </w:p>
@@ -8451,14 +6441,7 @@
           <w:rFonts w:ascii="MS Mincho" w:eastAsia="MS Mincho" w:hAnsi="MS Mincho"/>
           <w:lang w:val="ja-JP" w:eastAsia="ja-JP"/>
         </w:rPr>
-        <w:t xml:space="preserve">7.1 </w:t>
-      </w:r>
-      <w:r>
-        <w:rPr>
-          <w:rFonts w:ascii="MS Mincho" w:eastAsia="MS Mincho" w:hAnsi="MS Mincho"/>
-          <w:lang w:val="ja-JP" w:eastAsia="ja-JP"/>
-        </w:rPr>
-        <w:t>結果として確認できたこと</w:t>
+        <w:t>7.1 結果として確認できたこと</w:t>
       </w:r>
     </w:p>
     <w:p>
@@ -8492,63 +6475,7 @@
           <w:sz w:val="20"/>
           <w:lang w:val="ja-JP" w:eastAsia="ja-JP"/>
         </w:rPr>
-        <w:t>戦略三は、同一条件の</w:t>
-      </w:r>
-      <w:r>
-        <w:rPr>
-          <w:sz w:val="20"/>
-          <w:lang w:val="ja-JP" w:eastAsia="ja-JP"/>
-        </w:rPr>
-        <w:t>3M</w:t>
-      </w:r>
-      <w:r>
-        <w:rPr>
-          <w:sz w:val="20"/>
-          <w:lang w:val="ja-JP" w:eastAsia="ja-JP"/>
-        </w:rPr>
-        <w:t>社</w:t>
-      </w:r>
-      <w:r>
-        <w:rPr>
-          <w:sz w:val="20"/>
-          <w:lang w:val="ja-JP" w:eastAsia="ja-JP"/>
-        </w:rPr>
-        <w:t>2022</w:t>
-      </w:r>
-      <w:r>
-        <w:rPr>
-          <w:sz w:val="20"/>
-          <w:lang w:val="ja-JP" w:eastAsia="ja-JP"/>
-        </w:rPr>
-        <w:t>年で</w:t>
-      </w:r>
-      <w:r>
-        <w:rPr>
-          <w:sz w:val="20"/>
-          <w:lang w:val="ja-JP" w:eastAsia="ja-JP"/>
-        </w:rPr>
-        <w:t>27/27</w:t>
-      </w:r>
-      <w:r>
-        <w:rPr>
-          <w:sz w:val="20"/>
-          <w:lang w:val="ja-JP" w:eastAsia="ja-JP"/>
-        </w:rPr>
-        <w:t>を維持し、入力トークン数を</w:t>
-      </w:r>
-      <w:r>
-        <w:rPr>
-          <w:sz w:val="20"/>
-          <w:lang w:val="ja-JP" w:eastAsia="ja-JP"/>
-        </w:rPr>
-        <w:t>96.1%</w:t>
-      </w:r>
-      <w:r>
-        <w:rPr>
-          <w:sz w:val="20"/>
-          <w:lang w:val="ja-JP" w:eastAsia="ja-JP"/>
-        </w:rPr>
-        <w:t>削減した。</w:t>
+        <w:t>戦略三は、同一条件の3M社2022年で27/27を維持し、入力トークン数を96.1%削減した。</w:t>
       </w:r>
     </w:p>
     <w:p>
@@ -8565,91 +6492,7 @@
           <w:sz w:val="20"/>
           <w:lang w:val="ja-JP" w:eastAsia="ja-JP"/>
         </w:rPr>
-        <w:t>戦略三のマクロ平均正確性は、</w:t>
-      </w:r>
-      <w:r>
-        <w:rPr>
-          <w:sz w:val="20"/>
-          <w:lang w:val="ja-JP" w:eastAsia="ja-JP"/>
-        </w:rPr>
-        <w:t>GLM</w:t>
-      </w:r>
-      <w:r>
-        <w:rPr>
-          <w:sz w:val="20"/>
-          <w:lang w:val="ja-JP" w:eastAsia="ja-JP"/>
-        </w:rPr>
-        <w:t>思考モードで</w:t>
-      </w:r>
-      <w:r>
-        <w:rPr>
-          <w:sz w:val="20"/>
-          <w:lang w:val="ja-JP" w:eastAsia="ja-JP"/>
-        </w:rPr>
-        <w:t>99.71%</w:t>
-      </w:r>
-      <w:r>
-        <w:rPr>
-          <w:sz w:val="20"/>
-          <w:lang w:val="ja-JP" w:eastAsia="ja-JP"/>
-        </w:rPr>
-        <w:t>、</w:t>
-      </w:r>
-      <w:r>
-        <w:rPr>
-          <w:sz w:val="20"/>
-          <w:lang w:val="ja-JP" w:eastAsia="ja-JP"/>
-        </w:rPr>
-        <w:t>GLM</w:t>
-      </w:r>
-      <w:r>
-        <w:rPr>
-          <w:sz w:val="20"/>
-          <w:lang w:val="ja-JP" w:eastAsia="ja-JP"/>
-        </w:rPr>
-        <w:t>思考なしで</w:t>
-      </w:r>
-      <w:r>
-        <w:rPr>
-          <w:sz w:val="20"/>
-          <w:lang w:val="ja-JP" w:eastAsia="ja-JP"/>
-        </w:rPr>
-        <w:t>92.14%</w:t>
-      </w:r>
-      <w:r>
-        <w:rPr>
-          <w:sz w:val="20"/>
-          <w:lang w:val="ja-JP" w:eastAsia="ja-JP"/>
-        </w:rPr>
-        <w:t>、</w:t>
-      </w:r>
-      <w:r>
-        <w:rPr>
-          <w:sz w:val="20"/>
-          <w:lang w:val="ja-JP" w:eastAsia="ja-JP"/>
-        </w:rPr>
-        <w:t>Gemini</w:t>
-      </w:r>
-      <w:r>
-        <w:rPr>
-          <w:sz w:val="20"/>
-          <w:lang w:val="ja-JP" w:eastAsia="ja-JP"/>
-        </w:rPr>
-        <w:t>中程度で</w:t>
-      </w:r>
-      <w:r>
-        <w:rPr>
-          <w:sz w:val="20"/>
-          <w:lang w:val="ja-JP" w:eastAsia="ja-JP"/>
-        </w:rPr>
-        <w:t>97.98%</w:t>
-      </w:r>
-      <w:r>
-        <w:rPr>
-          <w:sz w:val="20"/>
-          <w:lang w:val="ja-JP" w:eastAsia="ja-JP"/>
-        </w:rPr>
-        <w:t>であった。</w:t>
+        <w:t>戦略三のマクロ平均正確性は、GLM思考モードで99.71%、GLM思考なしで92.14%、Gemini中程度で97.98%であった。</w:t>
       </w:r>
     </w:p>
     <w:p>
@@ -8681,14 +6524,7 @@
           <w:rFonts w:ascii="MS Mincho" w:eastAsia="MS Mincho" w:hAnsi="MS Mincho"/>
           <w:lang w:val="ja-JP" w:eastAsia="ja-JP"/>
         </w:rPr>
-        <w:t xml:space="preserve">7.2 </w:t>
-      </w:r>
-      <w:r>
-        <w:rPr>
-          <w:rFonts w:ascii="MS Mincho" w:eastAsia="MS Mincho" w:hAnsi="MS Mincho"/>
-          <w:lang w:val="ja-JP" w:eastAsia="ja-JP"/>
-        </w:rPr>
-        <w:t>結果の解釈</w:t>
+        <w:t>7.2 結果の解釈</w:t>
       </w:r>
     </w:p>
     <w:p>
@@ -8731,14 +6567,7 @@
           <w:rFonts w:ascii="MS Mincho" w:eastAsia="MS Mincho" w:hAnsi="MS Mincho"/>
           <w:lang w:val="ja-JP" w:eastAsia="ja-JP"/>
         </w:rPr>
-        <w:t xml:space="preserve">7.3 </w:t>
-      </w:r>
-      <w:r>
-        <w:rPr>
-          <w:rFonts w:ascii="MS Mincho" w:eastAsia="MS Mincho" w:hAnsi="MS Mincho"/>
-          <w:lang w:val="ja-JP" w:eastAsia="ja-JP"/>
-        </w:rPr>
-        <w:t>失敗と限界</w:t>
+        <w:t>7.3 失敗と限界</w:t>
       </w:r>
     </w:p>
     <w:p>
@@ -8755,21 +6584,7 @@
           <w:b/>
           <w:lang w:val="ja-JP" w:eastAsia="ja-JP"/>
         </w:rPr>
-        <w:t>表</w:t>
-      </w:r>
-      <w:r>
-        <w:rPr>
-          <w:b/>
-          <w:lang w:val="ja-JP" w:eastAsia="ja-JP"/>
-        </w:rPr>
-        <w:t>5</w:t>
-      </w:r>
-      <w:r>
-        <w:rPr>
-          <w:b/>
-          <w:lang w:val="ja-JP" w:eastAsia="ja-JP"/>
-        </w:rPr>
-        <w:t xml:space="preserve">　主な失敗</w:t>
+        <w:t>表5　主な失敗</w:t>
       </w:r>
     </w:p>
     <w:tbl>
@@ -9259,14 +7074,7 @@
                 <w:sz w:val="16"/>
                 <w:lang w:val="ja-JP" w:eastAsia="ja-JP"/>
               </w:rPr>
-              <w:t>0</w:t>
-            </w:r>
-            <w:r>
-              <w:rPr>
-                <w:sz w:val="16"/>
-                <w:lang w:val="ja-JP" w:eastAsia="ja-JP"/>
-              </w:rPr>
-              <w:t>と不明を混同する</w:t>
+              <w:t>0と不明を混同する</w:t>
             </w:r>
           </w:p>
         </w:tc>
@@ -9322,14 +7130,7 @@
                 <w:sz w:val="16"/>
                 <w:lang w:val="ja-JP" w:eastAsia="ja-JP"/>
               </w:rPr>
-              <w:t>算術で一意に決まる場合だけ</w:t>
-            </w:r>
-            <w:r>
-              <w:rPr>
-                <w:sz w:val="16"/>
-                <w:lang w:val="ja-JP" w:eastAsia="ja-JP"/>
-              </w:rPr>
-              <w:t>0</w:t>
+              <w:t>算術で一意に決まる場合だけ0</w:t>
             </w:r>
           </w:p>
         </w:tc>
@@ -9357,21 +7158,7 @@
                 <w:sz w:val="16"/>
                 <w:lang w:val="ja-JP" w:eastAsia="ja-JP"/>
               </w:rPr>
-              <w:t>根拠のない</w:t>
-            </w:r>
-            <w:r>
-              <w:rPr>
-                <w:sz w:val="16"/>
-                <w:lang w:val="ja-JP" w:eastAsia="ja-JP"/>
-              </w:rPr>
-              <w:t>0</w:t>
-            </w:r>
-            <w:r>
-              <w:rPr>
-                <w:sz w:val="16"/>
-                <w:lang w:val="ja-JP" w:eastAsia="ja-JP"/>
-              </w:rPr>
-              <w:t>を継続試験する</w:t>
+              <w:t>根拠のない0を継続試験する</w:t>
             </w:r>
           </w:p>
         </w:tc>
@@ -9517,14 +7304,7 @@
           <w:lang w:val="ja-JP" w:eastAsia="ja-JP"/>
         </w:rPr>
         <w:lastRenderedPageBreak/>
-        <w:t xml:space="preserve">7.4 </w:t>
-      </w:r>
-      <w:r>
-        <w:rPr>
-          <w:rFonts w:ascii="MS Mincho" w:eastAsia="MS Mincho" w:hAnsi="MS Mincho"/>
-          <w:lang w:val="ja-JP" w:eastAsia="ja-JP"/>
-        </w:rPr>
-        <w:t>コード監査で確認した状態</w:t>
+        <w:t>7.4 コード監査で確認した状態</w:t>
       </w:r>
     </w:p>
     <w:p>
@@ -9538,31 +7318,7 @@
         <w:rPr>
           <w:lang w:val="ja-JP" w:eastAsia="ja-JP"/>
         </w:rPr>
-        <w:t>自動試験は、バックエンド</w:t>
-      </w:r>
-      <w:r>
-        <w:rPr>
-          <w:lang w:val="ja-JP" w:eastAsia="ja-JP"/>
-        </w:rPr>
-        <w:t>103</w:t>
-      </w:r>
-      <w:r>
-        <w:rPr>
-          <w:lang w:val="ja-JP" w:eastAsia="ja-JP"/>
-        </w:rPr>
-        <w:t>件、画面側</w:t>
-      </w:r>
-      <w:r>
-        <w:rPr>
-          <w:lang w:val="ja-JP" w:eastAsia="ja-JP"/>
-        </w:rPr>
-        <w:t>28</w:t>
-      </w:r>
-      <w:r>
-        <w:rPr>
-          <w:lang w:val="ja-JP" w:eastAsia="ja-JP"/>
-        </w:rPr>
-        <w:t>件が成功した。画面側の本番向けビルドも成功した。製品コードは変更していない。</w:t>
+        <w:t>自動試験は、バックエンド103件、画面側28件が成功した。画面側の本番向けビルドも成功した。製品コードは変更していない。</w:t>
       </w:r>
     </w:p>
     <w:p>
@@ -9576,19 +7332,7 @@
         <w:rPr>
           <w:lang w:val="ja-JP" w:eastAsia="ja-JP"/>
         </w:rPr>
-        <w:t>重大な監査所見は、公開環境の読み取り専用設定が再構築用設定へ引き継がれず、更新操作が有効になる可能性である。認証のない公開デモ、単一サーバーとファイル保存への依存、再起動で消える一時状態も、製品化前に対応すべきである。詳細は付録</w:t>
-      </w:r>
-      <w:r>
-        <w:rPr>
-          <w:lang w:val="ja-JP" w:eastAsia="ja-JP"/>
-        </w:rPr>
-        <w:t>B</w:t>
-      </w:r>
-      <w:r>
-        <w:rPr>
-          <w:lang w:val="ja-JP" w:eastAsia="ja-JP"/>
-        </w:rPr>
-        <w:t>に示す。</w:t>
+        <w:t>重大な監査所見は、公開環境の読み取り専用設定が再構築用設定へ引き継がれず、更新操作が有効になる可能性である。認証のない公開デモ、単一サーバーとファイル保存への依存、再起動で消える一時状態も、製品化前に対応すべきである。詳細は付録Bに示す。</w:t>
       </w:r>
     </w:p>
     <w:p>
@@ -9608,14 +7352,7 @@
           <w:rFonts w:ascii="MS Mincho" w:eastAsia="MS Mincho" w:hAnsi="MS Mincho"/>
           <w:lang w:val="ja-JP" w:eastAsia="ja-JP"/>
         </w:rPr>
-        <w:t xml:space="preserve">8.0 </w:t>
-      </w:r>
-      <w:r>
-        <w:rPr>
-          <w:rFonts w:ascii="MS Mincho" w:eastAsia="MS Mincho" w:hAnsi="MS Mincho"/>
-          <w:lang w:val="ja-JP" w:eastAsia="ja-JP"/>
-        </w:rPr>
-        <w:t>結論・次の課題</w:t>
+        <w:t>8.0 結論・次の課題</w:t>
       </w:r>
       <w:bookmarkEnd w:id="9"/>
     </w:p>
@@ -9630,19 +7367,7 @@
         <w:rPr>
           <w:lang w:val="ja-JP" w:eastAsia="ja-JP"/>
         </w:rPr>
-        <w:t>本課題では、</w:t>
-      </w:r>
-      <w:r>
-        <w:rPr>
-          <w:lang w:val="ja-JP" w:eastAsia="ja-JP"/>
-        </w:rPr>
-        <w:t>PDF</w:t>
-      </w:r>
-      <w:r>
-        <w:rPr>
-          <w:lang w:val="ja-JP" w:eastAsia="ja-JP"/>
-        </w:rPr>
-        <w:t>から固定形式の出力を作る問題を、入力表現、指示と出力形式、検証と評価の三つへ分解した。三戦略を比較した結果、必要ページだけを選ぶ戦略三を採用した。</w:t>
+        <w:t>本課題では、PDFから固定形式の出力を作る問題を、入力表現、指示と出力形式、検証と評価の三つへ分解した。三戦略を比較した結果、必要ページだけを選ぶ戦略三を採用した。</w:t>
       </w:r>
     </w:p>
     <w:p>
@@ -9656,19 +7381,7 @@
         <w:rPr>
           <w:lang w:val="ja-JP" w:eastAsia="ja-JP"/>
         </w:rPr>
-        <w:t>採用理由は、正確性を監視しながら入力を大幅に減らし、根拠選択を再現できるためである。最終目的は、事業</w:t>
-      </w:r>
-      <w:r>
-        <w:rPr>
-          <w:lang w:val="ja-JP" w:eastAsia="ja-JP"/>
-        </w:rPr>
-        <w:t>PDF</w:t>
-      </w:r>
-      <w:r>
-        <w:rPr>
-          <w:lang w:val="ja-JP" w:eastAsia="ja-JP"/>
-        </w:rPr>
-        <w:t>から信頼できる構造化データを作り、同じ評価手順を継続的に使える状態にすることである。</w:t>
+        <w:t>採用理由は、正確性を監視しながら入力を大幅に減らし、根拠選択を再現できるためである。最終目的は、事業PDFから信頼できる構造化データを作り、同じ評価手順を継続的に使える状態にすることである。</w:t>
       </w:r>
     </w:p>
     <w:p>
@@ -9698,14 +7411,7 @@
           <w:sz w:val="20"/>
           <w:lang w:val="ja-JP" w:eastAsia="ja-JP"/>
         </w:rPr>
-        <w:t xml:space="preserve">1. </w:t>
-      </w:r>
-      <w:r>
-        <w:rPr>
-          <w:sz w:val="20"/>
-          <w:lang w:val="ja-JP" w:eastAsia="ja-JP"/>
-        </w:rPr>
-        <w:t>正解根拠ページを人手で記録し、ページ選択の再現率を測る。</w:t>
+        <w:t>1. 正解根拠ページを人手で記録し、ページ選択の再現率を測る。</w:t>
       </w:r>
     </w:p>
     <w:p>
@@ -9721,14 +7427,7 @@
           <w:sz w:val="20"/>
           <w:lang w:val="ja-JP" w:eastAsia="ja-JP"/>
         </w:rPr>
-        <w:t xml:space="preserve">2. </w:t>
-      </w:r>
-      <w:r>
-        <w:rPr>
-          <w:sz w:val="20"/>
-          <w:lang w:val="ja-JP" w:eastAsia="ja-JP"/>
-        </w:rPr>
-        <w:t>同一条件で複数回実行し、平均とばらつきを報告する。</w:t>
+        <w:t>2. 同一条件で複数回実行し、平均とばらつきを報告する。</w:t>
       </w:r>
     </w:p>
     <w:p>
@@ -9744,14 +7443,7 @@
           <w:sz w:val="20"/>
           <w:lang w:val="ja-JP" w:eastAsia="ja-JP"/>
         </w:rPr>
-        <w:t xml:space="preserve">3. </w:t>
-      </w:r>
-      <w:r>
-        <w:rPr>
-          <w:sz w:val="20"/>
-          <w:lang w:val="ja-JP" w:eastAsia="ja-JP"/>
-        </w:rPr>
-        <w:t>完全な正解表と一部だけ採点できる資料を分ける。</w:t>
+        <w:t>3. 完全な正解表と一部だけ採点できる資料を分ける。</w:t>
       </w:r>
     </w:p>
     <w:p>
@@ -9767,14 +7459,7 @@
           <w:sz w:val="20"/>
           <w:lang w:val="ja-JP" w:eastAsia="ja-JP"/>
         </w:rPr>
-        <w:t xml:space="preserve">4. </w:t>
-      </w:r>
-      <w:r>
-        <w:rPr>
-          <w:sz w:val="20"/>
-          <w:lang w:val="ja-JP" w:eastAsia="ja-JP"/>
-        </w:rPr>
-        <w:t>入力、文字認識、検証を分けて実費と時間を測る。</w:t>
+        <w:t>4. 入力、文字認識、検証を分けて実費と時間を測る。</w:t>
       </w:r>
     </w:p>
     <w:p>
@@ -9790,14 +7475,7 @@
           <w:sz w:val="20"/>
           <w:lang w:val="ja-JP" w:eastAsia="ja-JP"/>
         </w:rPr>
-        <w:t xml:space="preserve">5. </w:t>
-      </w:r>
-      <w:r>
-        <w:rPr>
-          <w:sz w:val="20"/>
-          <w:lang w:val="ja-JP" w:eastAsia="ja-JP"/>
-        </w:rPr>
-        <w:t>複数文書や任意質問が主用途になった時だけ、能動的検索を再評価する。</w:t>
+        <w:t>5. 複数文書や任意質問が主用途になった時だけ、能動的検索を再評価する。</w:t>
       </w:r>
     </w:p>
     <w:p>
@@ -9813,14 +7491,7 @@
           <w:sz w:val="20"/>
           <w:lang w:val="ja-JP" w:eastAsia="ja-JP"/>
         </w:rPr>
-        <w:t xml:space="preserve">6. </w:t>
-      </w:r>
-      <w:r>
-        <w:rPr>
-          <w:sz w:val="20"/>
-          <w:lang w:val="ja-JP" w:eastAsia="ja-JP"/>
-        </w:rPr>
-        <w:t>認証、利用者別の上限、永続的な処理状態、バックアップを導入する。</w:t>
+        <w:t>6. 認証、利用者別の上限、永続的な処理状態、バックアップを導入する。</w:t>
       </w:r>
     </w:p>
     <w:p>
@@ -9855,21 +7526,7 @@
           <w:sz w:val="20"/>
           <w:lang w:val="ja-JP" w:eastAsia="ja-JP"/>
         </w:rPr>
-        <w:t>課題原文「バクラク事業部</w:t>
-      </w:r>
-      <w:r>
-        <w:rPr>
-          <w:sz w:val="20"/>
-          <w:lang w:val="ja-JP" w:eastAsia="ja-JP"/>
-        </w:rPr>
-        <w:t>LLM</w:t>
-      </w:r>
-      <w:r>
-        <w:rPr>
-          <w:sz w:val="20"/>
-          <w:lang w:val="ja-JP" w:eastAsia="ja-JP"/>
-        </w:rPr>
-        <w:t>お題」</w:t>
+        <w:t>課題原文「バクラク事業部LLMお題」</w:t>
       </w:r>
     </w:p>
     <w:p>
@@ -10086,23 +7743,7 @@
                 <w:sz w:val="17"/>
                 <w:lang w:val="ja-JP" w:eastAsia="ja-JP"/>
               </w:rPr>
-              <w:t>出力値（</w:t>
-            </w:r>
-            <w:r>
-              <w:rPr>
-                <w:b/>
-                <w:sz w:val="17"/>
-                <w:lang w:val="ja-JP" w:eastAsia="ja-JP"/>
-              </w:rPr>
-              <w:t>M USD</w:t>
-            </w:r>
-            <w:r>
-              <w:rPr>
-                <w:b/>
-                <w:sz w:val="17"/>
-                <w:lang w:val="ja-JP" w:eastAsia="ja-JP"/>
-              </w:rPr>
-              <w:t>）</w:t>
+              <w:t>出力値（M USD）</w:t>
             </w:r>
           </w:p>
         </w:tc>
@@ -10136,23 +7777,7 @@
                 <w:sz w:val="17"/>
                 <w:lang w:eastAsia="ja-JP"/>
               </w:rPr>
-              <w:t>（</w:t>
-            </w:r>
-            <w:r>
-              <w:rPr>
-                <w:b/>
-                <w:sz w:val="17"/>
-                <w:lang w:eastAsia="ja-JP"/>
-              </w:rPr>
-              <w:t>M USD</w:t>
-            </w:r>
-            <w:r>
-              <w:rPr>
-                <w:b/>
-                <w:sz w:val="17"/>
-                <w:lang w:eastAsia="ja-JP"/>
-              </w:rPr>
-              <w:t>）</w:t>
+              <w:t>（M USD）</w:t>
             </w:r>
           </w:p>
         </w:tc>
@@ -13011,21 +10636,7 @@
           <w:lang w:val="ja-JP" w:eastAsia="ja-JP"/>
         </w:rPr>
         <w:lastRenderedPageBreak/>
-        <w:t>付録</w:t>
-      </w:r>
-      <w:r>
-        <w:rPr>
-          <w:rFonts w:ascii="MS Mincho" w:eastAsia="MS Mincho" w:hAnsi="MS Mincho"/>
-          <w:lang w:val="ja-JP" w:eastAsia="ja-JP"/>
-        </w:rPr>
-        <w:t>B</w:t>
-      </w:r>
-      <w:r>
-        <w:rPr>
-          <w:rFonts w:ascii="MS Mincho" w:eastAsia="MS Mincho" w:hAnsi="MS Mincho"/>
-          <w:lang w:val="ja-JP" w:eastAsia="ja-JP"/>
-        </w:rPr>
-        <w:t xml:space="preserve">　コード監査一覧</w:t>
+        <w:t>付録B　コード監査一覧</w:t>
       </w:r>
     </w:p>
     <w:p>
@@ -13039,21 +10650,7 @@
           <w:b/>
           <w:lang w:val="ja-JP" w:eastAsia="ja-JP"/>
         </w:rPr>
-        <w:t>表</w:t>
-      </w:r>
-      <w:r>
-        <w:rPr>
-          <w:b/>
-          <w:lang w:val="ja-JP" w:eastAsia="ja-JP"/>
-        </w:rPr>
-        <w:t>B1</w:t>
-      </w:r>
-      <w:r>
-        <w:rPr>
-          <w:b/>
-          <w:lang w:val="ja-JP" w:eastAsia="ja-JP"/>
-        </w:rPr>
-        <w:t xml:space="preserve">　優先度</w:t>
+        <w:t>表B1　優先度</w:t>
       </w:r>
     </w:p>
     <w:tbl>
@@ -13966,21 +11563,7 @@
           <w:rFonts w:ascii="MS Mincho" w:eastAsia="MS Mincho" w:hAnsi="MS Mincho"/>
           <w:lang w:val="ja-JP" w:eastAsia="ja-JP"/>
         </w:rPr>
-        <w:t>付録</w:t>
-      </w:r>
-      <w:r>
-        <w:rPr>
-          <w:rFonts w:ascii="MS Mincho" w:eastAsia="MS Mincho" w:hAnsi="MS Mincho"/>
-          <w:lang w:val="ja-JP" w:eastAsia="ja-JP"/>
-        </w:rPr>
-        <w:t>C</w:t>
-      </w:r>
-      <w:r>
-        <w:rPr>
-          <w:rFonts w:ascii="MS Mincho" w:eastAsia="MS Mincho" w:hAnsi="MS Mincho"/>
-          <w:lang w:val="ja-JP" w:eastAsia="ja-JP"/>
-        </w:rPr>
-        <w:t xml:space="preserve">　実装上の役割</w:t>
+        <w:t>付録C　実装上の役割</w:t>
       </w:r>
     </w:p>
     <w:p>
@@ -13997,21 +11580,7 @@
           <w:b/>
           <w:lang w:val="ja-JP" w:eastAsia="ja-JP"/>
         </w:rPr>
-        <w:t>表</w:t>
-      </w:r>
-      <w:r>
-        <w:rPr>
-          <w:b/>
-          <w:lang w:val="ja-JP" w:eastAsia="ja-JP"/>
-        </w:rPr>
-        <w:t>C1</w:t>
-      </w:r>
-      <w:r>
-        <w:rPr>
-          <w:b/>
-          <w:lang w:val="ja-JP" w:eastAsia="ja-JP"/>
-        </w:rPr>
-        <w:t xml:space="preserve">　処理</w:t>
+        <w:t>表C1　処理</w:t>
       </w:r>
     </w:p>
     <w:tbl>
@@ -14252,21 +11821,7 @@
                 <w:sz w:val="16"/>
                 <w:lang w:val="ja-JP" w:eastAsia="ja-JP"/>
               </w:rPr>
-              <w:t>年度、通貨、</w:t>
-            </w:r>
-            <w:r>
-              <w:rPr>
-                <w:sz w:val="16"/>
-                <w:lang w:val="ja-JP" w:eastAsia="ja-JP"/>
-              </w:rPr>
-              <w:t>27</w:t>
-            </w:r>
-            <w:r>
-              <w:rPr>
-                <w:sz w:val="16"/>
-                <w:lang w:val="ja-JP" w:eastAsia="ja-JP"/>
-              </w:rPr>
-              <w:t>項目、根拠の返し方を固定する</w:t>
+              <w:t>年度、通貨、27項目、根拠の返し方を固定する</w:t>
             </w:r>
           </w:p>
         </w:tc>
@@ -14466,31 +12021,7 @@
         <w:rPr>
           <w:lang w:val="ja-JP" w:eastAsia="ja-JP"/>
         </w:rPr>
-        <w:t>実際の指示文では、原資料だけを根拠とすること、最新の完了年度を選ぶこと、原資料の通貨を保つこと、百万単位へ換算すること、</w:t>
-      </w:r>
-      <w:r>
-        <w:rPr>
-          <w:lang w:val="ja-JP" w:eastAsia="ja-JP"/>
-        </w:rPr>
-        <w:t>27</w:t>
-      </w:r>
-      <w:r>
-        <w:rPr>
-          <w:lang w:val="ja-JP" w:eastAsia="ja-JP"/>
-        </w:rPr>
-        <w:t>項目を追加・削除・改名・並べ替えしないこと、根拠不足と</w:t>
-      </w:r>
-      <w:r>
-        <w:rPr>
-          <w:lang w:val="ja-JP" w:eastAsia="ja-JP"/>
-        </w:rPr>
-        <w:t>0</w:t>
-      </w:r>
-      <w:r>
-        <w:rPr>
-          <w:lang w:val="ja-JP" w:eastAsia="ja-JP"/>
-        </w:rPr>
-        <w:t>を区別することを明示した。</w:t>
+        <w:t>実際の指示文では、原資料だけを根拠とすること、最新の完了年度を選ぶこと、原資料の通貨を保つこと、百万単位へ換算すること、27項目を追加・削除・改名・並べ替えしないこと、根拠不足と0を区別することを明示した。</w:t>
       </w:r>
     </w:p>
     <w:sectPr>

</xml_diff>

<commit_message>
Visitors manage their own run history; settings drop the FX-rate and OCR-policy boxes
Run deletion is workspace-scoped server-side (a visitor can only ever
delete runs their anonymous workspace owns), so it belongs on the demo
allowlist rather than behind the operator gate — the read-only toast no
longer appears for deleting run logs. Credentials, prompts, corpus records
and golden answers remain operator-only; the API key is changeable only in
a local deployment. The display FX-rate input and the static OCR-policy
note leave the Settings page.
</commit_message>
<xml_diff>
--- a/docs/バクラク事業部技術_実験報告書_完成版.docx
+++ b/docs/バクラク事業部技術_実験報告書_完成版.docx
@@ -821,7 +821,7 @@
             <w:noProof/>
             <w:webHidden/>
           </w:rPr>
-          <w:t>6</w:t>
+          <w:t>7</w:t>
         </w:r>
         <w:r>
           <w:rPr>
@@ -890,7 +890,7 @@
             <w:noProof/>
             <w:webHidden/>
           </w:rPr>
-          <w:t>7</w:t>
+          <w:t>8</w:t>
         </w:r>
         <w:r>
           <w:rPr>
@@ -1097,7 +1097,7 @@
             <w:noProof/>
             <w:webHidden/>
           </w:rPr>
-          <w:t>15</w:t>
+          <w:t>16</w:t>
         </w:r>
         <w:r>
           <w:rPr>
@@ -1166,7 +1166,7 @@
             <w:noProof/>
             <w:webHidden/>
           </w:rPr>
-          <w:t>16</w:t>
+          <w:t>17</w:t>
         </w:r>
         <w:r>
           <w:rPr>
@@ -1235,7 +1235,7 @@
             <w:noProof/>
             <w:webHidden/>
           </w:rPr>
-          <w:t>17</w:t>
+          <w:t>18</w:t>
         </w:r>
         <w:r>
           <w:rPr>
@@ -18294,6 +18294,7 @@
     <w:p>
       <w:pPr>
         <w:pStyle w:val="Heading2"/>
+        <w:pageBreakBefore/>
         <w:rPr>
           <w:lang w:eastAsia="ja-JP"/>
         </w:rPr>

</xml_diff>

<commit_message>
Serve only the operator's runs in the published benchmark feed
/api/benchmark-runs returned list_runs(None) — every workspace — filtered
only by corpus hash, so any visitor extraction on a corpus PDF entered the
published numbers. Evidence: a demo run of 3M FY2022 sat in the live feed
beside the official one (100 Gemini S3 runs across 99 documents). Making
Gemini medium the public default sharpened this, since a visitor's default
run now matches the published source exactly. The feed is now scoped to the
workspace the corpus runner stamps, shared as BENCHMARK_WORKSPACE_ID so the
runner and the reader cannot drift apart. Visitor runs are untouched and
still visible in their own history.
</commit_message>
<xml_diff>
--- a/docs/バクラク事業部技術_実験報告書_完成版.docx
+++ b/docs/バクラク事業部技術_実験報告書_完成版.docx
@@ -1028,7 +1028,7 @@
             <w:noProof/>
             <w:webHidden/>
           </w:rPr>
-          <w:t>14</w:t>
+          <w:t>15</w:t>
         </w:r>
         <w:r>
           <w:rPr>
@@ -1343,7 +1343,7 @@
         </w:rPr>
       </w:pPr>
       <w:r>
-        <w:pict w14:anchorId="48BC0F2B">
+        <w:pict w14:anchorId="4557F54B">
           <v:rect id="Horizontal Line 1" o:spid="_x0000_s2051" alt="" style="width:481.9pt;height:.05pt;visibility:visible;mso-wrap-style:square;mso-width-percent:0;mso-height-percent:0;mso-left-percent:-10001;mso-top-percent:-10001;mso-position-horizontal:absolute;mso-position-horizontal-relative:char;mso-position-vertical:absolute;mso-position-vertical-relative:line;mso-width-percent:0;mso-height-percent:0;mso-left-percent:-10001;mso-top-percent:-10001;v-text-anchor:top" filled="f">
             <o:lock v:ext="edit" rotation="t" aspectratio="t" verticies="t" text="t" shapetype="t"/>
             <w10:anchorlock/>
@@ -1437,7 +1437,7 @@
         <w:rPr>
           <w:lang w:val="ja-JP" w:eastAsia="ja-JP"/>
         </w:rPr>
-        <w:pict w14:anchorId="541580E2">
+        <w:pict w14:anchorId="5E1DD2EC">
           <v:rect id="Horizontal Line 6" o:spid="_x0000_s2050" alt="" style="width:481.9pt;height:.1pt;visibility:visible;mso-wrap-style:square;mso-width-percent:0;mso-height-percent:0;mso-left-percent:-10001;mso-top-percent:-10001;mso-position-horizontal:absolute;mso-position-horizontal-relative:char;mso-position-vertical:absolute;mso-position-vertical-relative:line;mso-width-percent:0;mso-height-percent:0;mso-left-percent:-10001;mso-top-percent:-10001;v-text-anchor:top" filled="f">
             <o:lock v:ext="edit" rotation="t" aspectratio="t" verticies="t" text="t" shapetype="t"/>
             <w10:anchorlock/>
@@ -1491,7 +1491,19 @@
         <w:rPr>
           <w:lang w:val="ja-JP" w:eastAsia="ja-JP"/>
         </w:rPr>
-        <w:t>本課題は、3M社の2022年Annual Reportから、指定された27項目の「資産の部」をM USD単位で作成するものである。出力する項目名、順序、型は固定されている。ルールベース処理との組合せは認められている。また、一社だけに合わせた処理ではなく、他社の年次報告書にも適用できる構成が求められる。</w:t>
+        <w:t>本課題は、</w:t>
+      </w:r>
+      <w:r>
+        <w:rPr>
+          <w:lang w:val="ja-JP" w:eastAsia="ja-JP"/>
+        </w:rPr>
+        <w:t>年次報告書</w:t>
+      </w:r>
+      <w:r>
+        <w:rPr>
+          <w:lang w:val="ja-JP" w:eastAsia="ja-JP"/>
+        </w:rPr>
+        <w:t>から、指定された27項目の「資産の部」をM USD単位で作成するものである。出力する項目名、順序、型は固定されている。ルールベース処理との組合せは認められている。また、一社だけに合わせた処理ではなく、他社の年次報告書にも適用できる構成が求められる。</w:t>
       </w:r>
     </w:p>
     <w:p>
@@ -2464,7 +2476,31 @@
         <w:rPr>
           <w:lang w:val="ja-JP" w:eastAsia="ja-JP"/>
         </w:rPr>
-        <w:t>主な評価対象は3M社の2022年Annual Reportである。全コーパスは41社・102件の一意なPDFから成る。内訳は、3M社と日本企業13社の公式ソース確認済み年次報告書・有価証券報告書75資料と、追加27社の一ページ法定貸借対照表公告27資料である。公告群は`catr.jp`から取得した補助群であり、台帳上`official_source_verified`ではない。したがって、102資料すべてをAnnual Reportとは呼ばず、他社報告書への一般化は75資料の報告書群で評価し、公告群は開示項目が少ない資料への耐性として区別して解釈する。</w:t>
+        <w:t>主な評価対象は3M社の2022年Annual Reportである。全コーパスは</w:t>
+      </w:r>
+      <w:r>
+        <w:rPr>
+          <w:lang w:eastAsia="ja-JP"/>
+        </w:rPr>
+        <w:t>38</w:t>
+      </w:r>
+      <w:r>
+        <w:rPr>
+          <w:lang w:val="ja-JP" w:eastAsia="ja-JP"/>
+        </w:rPr>
+        <w:t>社・</w:t>
+      </w:r>
+      <w:r>
+        <w:rPr>
+          <w:lang w:eastAsia="ja-JP"/>
+        </w:rPr>
+        <w:t>99</w:t>
+      </w:r>
+      <w:r>
+        <w:rPr>
+          <w:lang w:val="ja-JP" w:eastAsia="ja-JP"/>
+        </w:rPr>
+        <w:t>件の一意なPDFから成る。内訳は、3M社と日本企業13社の公式ソース確認済み年次報告書・有価証券報告書75資料と、追加27社の一ページ法定貸借対照表公告27資料である。公告群は`catr.jp`から取得した補助群であり、台帳上`official_source_verified`ではない。したがって、102資料すべてをAnnual Reportとは呼ばず、他社報告書への一般化は75資料の報告書群で評価し、公告群は開示項目が少ない資料への耐性として区別して解釈する。</w:t>
       </w:r>
     </w:p>
     <w:p>

</xml_diff>